<commit_message>
Unificar el formato de los documentos: letra en negro y versión final del diseño
</commit_message>
<xml_diff>
--- a/docs/01-inicio/ES (OPM2-03.I.TPL.v3.0.1).Acta_de_Constitución_del_Proyecto.(GASTRO-SIM).(05-10-2026).(v1.2).docx
+++ b/docs/01-inicio/ES (OPM2-03.I.TPL.v3.0.1).Acta_de_Constitución_del_Proyecto.(GASTRO-SIM).(05-10-2026).(v1.2).docx
@@ -162,7 +162,7 @@
           <w:rPr>
             <w:rFonts w:asciiTheme="minorHAnsi" w:eastAsia="PMingLiU" w:hAnsiTheme="minorHAnsi" w:cstheme="minorHAnsi"/>
             <w:b/>
-            <w:color w:val="984806"/>
+            <w:color w:val="000000"/>
             <w:sz w:val="40"/>
             <w:szCs w:val="40"/>
             <w:lang w:val="es-ES"/>
@@ -199,7 +199,7 @@
         <w:rPr>
           <w:rFonts w:ascii="Calibri" w:hAnsi="Calibri"/>
           <w:b/>
-          <w:color w:val="E36C0A" w:themeColor="accent6" w:themeShade="BF"/>
+          <w:color w:val="000000"/>
           <w:sz w:val="40"/>
           <w:lang w:val="es-ES"/>
         </w:rPr>
@@ -232,7 +232,7 @@
           <w:rPr>
             <w:rFonts w:asciiTheme="minorHAnsi" w:eastAsia="Calibri" w:hAnsiTheme="minorHAnsi" w:cstheme="minorHAnsi"/>
             <w:bCs/>
-            <w:color w:val="984806" w:themeColor="accent6" w:themeShade="80"/>
+            <w:color w:val="000000"/>
             <w:lang w:val="es-ES"/>
           </w:rPr>
           <w:alias w:val="Date"/>
@@ -292,7 +292,7 @@
         <w:sdtPr>
           <w:rPr>
             <w:rFonts w:asciiTheme="minorHAnsi" w:eastAsia="PMingLiU" w:hAnsiTheme="minorHAnsi" w:cstheme="minorHAnsi"/>
-            <w:color w:val="984806" w:themeColor="accent6" w:themeShade="80"/>
+            <w:color w:val="000000"/>
             <w:lang w:val="es-ES"/>
           </w:rPr>
           <w:alias w:val="Version"/>
@@ -317,7 +317,7 @@
       <w:r>
         <w:rPr>
           <w:rFonts w:asciiTheme="minorHAnsi" w:hAnsiTheme="minorHAnsi" w:cstheme="minorHAnsi"/>
-          <w:color w:val="984806" w:themeColor="accent6" w:themeShade="80"/>
+          <w:color w:val="000000"/>
           <w:lang w:val="es-ES"/>
         </w:rPr>
         <w:t xml:space="preserve"> </w:t>
@@ -483,7 +483,7 @@
         <w:rPr>
           <w:rFonts w:asciiTheme="minorHAnsi" w:hAnsiTheme="minorHAnsi"/>
           <w:i/>
-          <w:color w:val="808080" w:themeColor="background1" w:themeShade="80"/>
+          <w:color w:val="000000"/>
           <w:sz w:val="20"/>
           <w:lang w:val="es-ES"/>
         </w:rPr>
@@ -492,7 +492,7 @@
         <w:rPr>
           <w:rFonts w:asciiTheme="minorHAnsi" w:hAnsiTheme="minorHAnsi"/>
           <w:i/>
-          <w:color w:val="808080" w:themeColor="background1" w:themeShade="80"/>
+          <w:color w:val="000000"/>
           <w:sz w:val="20"/>
           <w:lang w:val="es-ES"/>
         </w:rPr>
@@ -502,7 +502,7 @@
         <w:rPr>
           <w:rFonts w:asciiTheme="minorHAnsi" w:hAnsiTheme="minorHAnsi"/>
           <w:i/>
-          <w:color w:val="808080" w:themeColor="background1" w:themeShade="80"/>
+          <w:color w:val="000000"/>
           <w:sz w:val="20"/>
           <w:lang w:val="es-ES"/>
         </w:rPr>
@@ -515,7 +515,7 @@
         <w:rPr>
           <w:rFonts w:asciiTheme="minorHAnsi" w:hAnsiTheme="minorHAnsi"/>
           <w:i/>
-          <w:color w:val="808080" w:themeColor="background1" w:themeShade="80"/>
+          <w:color w:val="000000"/>
           <w:sz w:val="20"/>
           <w:lang w:val="es-ES"/>
         </w:rPr>
@@ -524,7 +524,7 @@
         <w:rPr>
           <w:rFonts w:asciiTheme="minorHAnsi" w:hAnsiTheme="minorHAnsi"/>
           <w:i/>
-          <w:color w:val="808080" w:themeColor="background1" w:themeShade="80"/>
+          <w:color w:val="000000"/>
           <w:sz w:val="20"/>
           <w:lang w:val="es-ES"/>
         </w:rPr>
@@ -534,7 +534,7 @@
         <w:rPr>
           <w:rFonts w:asciiTheme="minorHAnsi" w:hAnsiTheme="minorHAnsi"/>
           <w:i/>
-          <w:color w:val="808080" w:themeColor="background1" w:themeShade="80"/>
+          <w:color w:val="000000"/>
           <w:sz w:val="20"/>
           <w:lang w:val="es-ES"/>
         </w:rPr>
@@ -544,7 +544,7 @@
         <w:rPr>
           <w:rFonts w:asciiTheme="minorHAnsi" w:hAnsiTheme="minorHAnsi"/>
           <w:i/>
-          <w:color w:val="808080" w:themeColor="background1" w:themeShade="80"/>
+          <w:color w:val="000000"/>
           <w:sz w:val="20"/>
           <w:lang w:val="es-ES"/>
         </w:rPr>
@@ -557,7 +557,7 @@
         <w:rPr>
           <w:rFonts w:asciiTheme="minorHAnsi" w:hAnsiTheme="minorHAnsi"/>
           <w:i/>
-          <w:color w:val="0000FF"/>
+          <w:color w:val="000000"/>
           <w:sz w:val="20"/>
           <w:u w:val="single"/>
           <w:lang w:val="es-ES"/>
@@ -882,7 +882,7 @@
           <w:sdtPr>
             <w:rPr>
               <w:rFonts w:asciiTheme="minorHAnsi" w:hAnsiTheme="minorHAnsi" w:cstheme="minorHAnsi"/>
-              <w:color w:val="984806" w:themeColor="accent6" w:themeShade="80"/>
+              <w:color w:val="000000"/>
               <w:sz w:val="20"/>
               <w:lang w:val="es-ES"/>
             </w:rPr>
@@ -982,7 +982,7 @@
               <w:jc w:val="left"/>
               <w:rPr>
                 <w:rFonts w:asciiTheme="minorHAnsi" w:eastAsia="PMingLiU" w:hAnsiTheme="minorHAnsi" w:cstheme="minorHAnsi"/>
-                <w:color w:val="984806" w:themeColor="accent6" w:themeShade="80"/>
+                <w:color w:val="000000"/>
                 <w:sz w:val="20"/>
                 <w:lang w:val="es-ES"/>
               </w:rPr>
@@ -1081,7 +1081,7 @@
               <w:jc w:val="left"/>
               <w:rPr>
                 <w:rFonts w:asciiTheme="minorHAnsi" w:eastAsia="PMingLiU" w:hAnsiTheme="minorHAnsi" w:cstheme="minorHAnsi"/>
-                <w:color w:val="984806" w:themeColor="accent6" w:themeShade="80"/>
+                <w:color w:val="000000"/>
                 <w:sz w:val="20"/>
                 <w:lang w:val="es-ES"/>
               </w:rPr>
@@ -1170,7 +1170,7 @@
               <w:jc w:val="left"/>
               <w:rPr>
                 <w:rFonts w:asciiTheme="minorHAnsi" w:eastAsia="PMingLiU" w:hAnsiTheme="minorHAnsi" w:cstheme="minorHAnsi"/>
-                <w:color w:val="984806" w:themeColor="accent6" w:themeShade="80"/>
+                <w:color w:val="000000"/>
                 <w:sz w:val="20"/>
                 <w:lang w:val="es-ES"/>
               </w:rPr>
@@ -1254,7 +1254,7 @@
               <w:jc w:val="left"/>
               <w:rPr>
                 <w:rFonts w:asciiTheme="minorHAnsi" w:eastAsia="PMingLiU" w:hAnsiTheme="minorHAnsi" w:cstheme="minorHAnsi"/>
-                <w:color w:val="984806" w:themeColor="accent6" w:themeShade="80"/>
+                <w:color w:val="000000"/>
                 <w:sz w:val="20"/>
                 <w:lang w:val="es-ES"/>
               </w:rPr>
@@ -1327,7 +1327,7 @@
           <w:sdtPr>
             <w:rPr>
               <w:rFonts w:asciiTheme="minorHAnsi" w:eastAsia="PMingLiU" w:hAnsiTheme="minorHAnsi" w:cstheme="minorHAnsi"/>
-              <w:color w:val="984806" w:themeColor="accent6" w:themeShade="80"/>
+              <w:color w:val="000000"/>
               <w:sz w:val="20"/>
               <w:lang w:val="es-ES"/>
             </w:rPr>
@@ -1440,7 +1440,7 @@
               <w:rPr>
                 <w:rFonts w:asciiTheme="minorHAnsi" w:eastAsia="PMingLiU" w:hAnsiTheme="minorHAnsi" w:cstheme="minorHAnsi"/>
                 <w:bCs/>
-                <w:color w:val="984806" w:themeColor="accent6" w:themeShade="80"/>
+                <w:color w:val="000000"/>
                 <w:sz w:val="20"/>
                 <w:lang w:val="es-ES"/>
               </w:rPr>
@@ -1450,7 +1450,7 @@
                 <w:rPr>
                   <w:rFonts w:asciiTheme="minorHAnsi" w:hAnsiTheme="minorHAnsi" w:cstheme="minorHAnsi"/>
                   <w:bCs/>
-                  <w:color w:val="984806" w:themeColor="accent6" w:themeShade="80"/>
+                  <w:color w:val="000000"/>
                   <w:sz w:val="20"/>
                   <w:lang w:val="es-ES"/>
                 </w:rPr>
@@ -1532,7 +1532,7 @@
               <w:rPr>
                 <w:rFonts w:asciiTheme="minorHAnsi" w:eastAsia="PMingLiU" w:hAnsiTheme="minorHAnsi" w:cstheme="minorHAnsi"/>
                 <w:bCs/>
-                <w:color w:val="984806" w:themeColor="accent6" w:themeShade="80"/>
+                <w:color w:val="000000"/>
                 <w:sz w:val="20"/>
                 <w:lang w:val="es-ES"/>
               </w:rPr>
@@ -1541,7 +1541,7 @@
               <w:sdtPr>
                 <w:rPr>
                   <w:rFonts w:asciiTheme="minorHAnsi" w:eastAsia="PMingLiU" w:hAnsiTheme="minorHAnsi" w:cstheme="minorHAnsi"/>
-                  <w:color w:val="984806" w:themeColor="accent6" w:themeShade="80"/>
+                  <w:color w:val="000000"/>
                   <w:sz w:val="20"/>
                   <w:lang w:val="es-ES"/>
                 </w:rPr>
@@ -1903,7 +1903,7 @@
               <w:jc w:val="left"/>
               <w:rPr>
                 <w:rFonts w:asciiTheme="minorHAnsi" w:eastAsia="PMingLiU" w:hAnsiTheme="minorHAnsi" w:cstheme="minorHAnsi"/>
-                <w:color w:val="000000" w:themeColor="text1"/>
+                <w:color w:val="000000"/>
                 <w:sz w:val="20"/>
                 <w:szCs w:val="22"/>
                 <w:lang w:val="es-ES"/>
@@ -1934,7 +1934,7 @@
               <w:jc w:val="left"/>
               <w:rPr>
                 <w:rFonts w:asciiTheme="minorHAnsi" w:eastAsia="PMingLiU" w:hAnsiTheme="minorHAnsi" w:cstheme="minorHAnsi"/>
-                <w:color w:val="000000" w:themeColor="text1"/>
+                <w:color w:val="000000"/>
                 <w:sz w:val="20"/>
                 <w:szCs w:val="22"/>
                 <w:lang w:val="es-ES"/>
@@ -1983,7 +1983,7 @@
               <w:rPr>
                 <w:rFonts w:asciiTheme="minorHAnsi" w:eastAsia="Calibri" w:hAnsiTheme="minorHAnsi" w:cstheme="minorHAnsi"/>
                 <w:i/>
-                <w:color w:val="808080"/>
+                <w:color w:val="000000"/>
                 <w:sz w:val="20"/>
                 <w:szCs w:val="22"/>
                 <w:lang w:val="es-ES"/>
@@ -2015,7 +2015,7 @@
               <w:jc w:val="left"/>
               <w:rPr>
                 <w:rFonts w:asciiTheme="minorHAnsi" w:eastAsia="Calibri" w:hAnsiTheme="minorHAnsi" w:cstheme="minorHAnsi"/>
-                <w:color w:val="000000" w:themeColor="text1"/>
+                <w:color w:val="000000"/>
                 <w:sz w:val="20"/>
                 <w:szCs w:val="22"/>
                 <w:lang w:val="es-ES"/>
@@ -2041,7 +2041,7 @@
               <w:jc w:val="left"/>
               <w:rPr>
                 <w:rFonts w:asciiTheme="minorHAnsi" w:eastAsia="PMingLiU" w:hAnsiTheme="minorHAnsi" w:cstheme="minorHAnsi"/>
-                <w:color w:val="000000" w:themeColor="text1"/>
+                <w:color w:val="000000"/>
                 <w:sz w:val="20"/>
                 <w:szCs w:val="22"/>
                 <w:lang w:val="es-ES"/>
@@ -2077,7 +2077,7 @@
               <w:jc w:val="left"/>
               <w:rPr>
                 <w:rFonts w:asciiTheme="minorHAnsi" w:eastAsia="PMingLiU" w:hAnsiTheme="minorHAnsi" w:cstheme="minorHAnsi"/>
-                <w:color w:val="000000" w:themeColor="text1"/>
+                <w:color w:val="000000"/>
                 <w:sz w:val="20"/>
                 <w:szCs w:val="22"/>
                 <w:lang w:val="es-ES"/>
@@ -2108,7 +2108,7 @@
               <w:jc w:val="left"/>
               <w:rPr>
                 <w:rFonts w:asciiTheme="minorHAnsi" w:eastAsia="Calibri" w:hAnsiTheme="minorHAnsi" w:cstheme="minorHAnsi"/>
-                <w:color w:val="000000" w:themeColor="text1"/>
+                <w:color w:val="000000"/>
                 <w:sz w:val="20"/>
                 <w:szCs w:val="22"/>
                 <w:lang w:val="es-ES"/>
@@ -2140,7 +2140,7 @@
               <w:jc w:val="left"/>
               <w:rPr>
                 <w:rFonts w:asciiTheme="minorHAnsi" w:eastAsia="Calibri" w:hAnsiTheme="minorHAnsi" w:cstheme="minorHAnsi"/>
-                <w:color w:val="000000" w:themeColor="text1"/>
+                <w:color w:val="000000"/>
                 <w:sz w:val="20"/>
                 <w:szCs w:val="22"/>
                 <w:lang w:val="es-ES"/>
@@ -2172,7 +2172,7 @@
               <w:jc w:val="left"/>
               <w:rPr>
                 <w:rFonts w:asciiTheme="minorHAnsi" w:eastAsia="PMingLiU" w:hAnsiTheme="minorHAnsi" w:cstheme="minorHAnsi"/>
-                <w:color w:val="000000" w:themeColor="text1"/>
+                <w:color w:val="000000"/>
                 <w:sz w:val="20"/>
                 <w:szCs w:val="22"/>
                 <w:lang w:val="es-ES"/>
@@ -2222,7 +2222,7 @@
               <w:jc w:val="left"/>
               <w:rPr>
                 <w:rFonts w:asciiTheme="minorHAnsi" w:eastAsia="PMingLiU" w:hAnsiTheme="minorHAnsi" w:cstheme="minorHAnsi"/>
-                <w:color w:val="000000" w:themeColor="text1"/>
+                <w:color w:val="000000"/>
                 <w:sz w:val="20"/>
                 <w:szCs w:val="22"/>
                 <w:lang w:val="es-ES"/>
@@ -2282,7 +2282,7 @@
               <w:jc w:val="left"/>
               <w:rPr>
                 <w:rFonts w:asciiTheme="minorHAnsi" w:eastAsia="Calibri" w:hAnsiTheme="minorHAnsi" w:cstheme="minorHAnsi"/>
-                <w:color w:val="000000" w:themeColor="text1"/>
+                <w:color w:val="000000"/>
                 <w:sz w:val="20"/>
                 <w:szCs w:val="22"/>
                 <w:lang w:val="es-ES"/>
@@ -2314,7 +2314,7 @@
               <w:jc w:val="left"/>
               <w:rPr>
                 <w:rFonts w:asciiTheme="minorHAnsi" w:eastAsia="Calibri" w:hAnsiTheme="minorHAnsi" w:cstheme="minorHAnsi"/>
-                <w:color w:val="000000" w:themeColor="text1"/>
+                <w:color w:val="000000"/>
                 <w:sz w:val="20"/>
                 <w:szCs w:val="22"/>
                 <w:lang w:val="es-ES"/>
@@ -2346,7 +2346,7 @@
               <w:jc w:val="left"/>
               <w:rPr>
                 <w:rFonts w:asciiTheme="minorHAnsi" w:eastAsia="PMingLiU" w:hAnsiTheme="minorHAnsi" w:cstheme="minorHAnsi"/>
-                <w:color w:val="000000" w:themeColor="text1"/>
+                <w:color w:val="000000"/>
                 <w:sz w:val="20"/>
                 <w:szCs w:val="22"/>
                 <w:lang w:val="es-ES"/>
@@ -2382,7 +2382,7 @@
               <w:jc w:val="left"/>
               <w:rPr>
                 <w:rFonts w:asciiTheme="minorHAnsi" w:eastAsia="PMingLiU" w:hAnsiTheme="minorHAnsi" w:cstheme="minorHAnsi"/>
-                <w:color w:val="000000" w:themeColor="text1"/>
+                <w:color w:val="000000"/>
                 <w:sz w:val="20"/>
                 <w:szCs w:val="22"/>
                 <w:lang w:val="es-ES"/>
@@ -2413,7 +2413,7 @@
               <w:jc w:val="left"/>
               <w:rPr>
                 <w:rFonts w:asciiTheme="minorHAnsi" w:eastAsia="Calibri" w:hAnsiTheme="minorHAnsi" w:cstheme="minorHAnsi"/>
-                <w:color w:val="000000" w:themeColor="text1"/>
+                <w:color w:val="000000"/>
                 <w:sz w:val="20"/>
                 <w:szCs w:val="22"/>
                 <w:lang w:val="es-ES"/>
@@ -2445,7 +2445,7 @@
               <w:jc w:val="left"/>
               <w:rPr>
                 <w:rFonts w:asciiTheme="minorHAnsi" w:eastAsia="Calibri" w:hAnsiTheme="minorHAnsi" w:cstheme="minorHAnsi"/>
-                <w:color w:val="000000" w:themeColor="text1"/>
+                <w:color w:val="000000"/>
                 <w:sz w:val="20"/>
                 <w:szCs w:val="22"/>
                 <w:lang w:val="es-ES"/>
@@ -2477,7 +2477,7 @@
               <w:jc w:val="left"/>
               <w:rPr>
                 <w:rFonts w:asciiTheme="minorHAnsi" w:eastAsia="PMingLiU" w:hAnsiTheme="minorHAnsi" w:cstheme="minorHAnsi"/>
-                <w:color w:val="000000" w:themeColor="text1"/>
+                <w:color w:val="000000"/>
                 <w:sz w:val="20"/>
                 <w:szCs w:val="22"/>
                 <w:lang w:val="es-ES"/>
@@ -2513,7 +2513,7 @@
               <w:jc w:val="left"/>
               <w:rPr>
                 <w:rFonts w:asciiTheme="minorHAnsi" w:eastAsia="PMingLiU" w:hAnsiTheme="minorHAnsi" w:cstheme="minorHAnsi"/>
-                <w:color w:val="000000" w:themeColor="text1"/>
+                <w:color w:val="000000"/>
                 <w:sz w:val="20"/>
                 <w:szCs w:val="22"/>
                 <w:lang w:val="es-ES"/>
@@ -2544,7 +2544,7 @@
               <w:jc w:val="left"/>
               <w:rPr>
                 <w:rFonts w:asciiTheme="minorHAnsi" w:eastAsia="Calibri" w:hAnsiTheme="minorHAnsi" w:cstheme="minorHAnsi"/>
-                <w:color w:val="000000" w:themeColor="text1"/>
+                <w:color w:val="000000"/>
                 <w:sz w:val="20"/>
                 <w:szCs w:val="22"/>
                 <w:lang w:val="es-ES"/>
@@ -2576,7 +2576,7 @@
               <w:jc w:val="left"/>
               <w:rPr>
                 <w:rFonts w:asciiTheme="minorHAnsi" w:eastAsia="Calibri" w:hAnsiTheme="minorHAnsi" w:cstheme="minorHAnsi"/>
-                <w:color w:val="000000" w:themeColor="text1"/>
+                <w:color w:val="000000"/>
                 <w:sz w:val="20"/>
                 <w:szCs w:val="22"/>
                 <w:lang w:val="es-ES"/>
@@ -2608,7 +2608,7 @@
               <w:jc w:val="left"/>
               <w:rPr>
                 <w:rFonts w:asciiTheme="minorHAnsi" w:eastAsia="PMingLiU" w:hAnsiTheme="minorHAnsi" w:cstheme="minorHAnsi"/>
-                <w:color w:val="000000" w:themeColor="text1"/>
+                <w:color w:val="000000"/>
                 <w:sz w:val="20"/>
                 <w:szCs w:val="22"/>
                 <w:lang w:val="es-ES"/>
@@ -2644,7 +2644,7 @@
               <w:jc w:val="left"/>
               <w:rPr>
                 <w:rFonts w:asciiTheme="minorHAnsi" w:eastAsia="PMingLiU" w:hAnsiTheme="minorHAnsi" w:cstheme="minorHAnsi"/>
-                <w:color w:val="000000" w:themeColor="text1"/>
+                <w:color w:val="000000"/>
                 <w:sz w:val="20"/>
                 <w:szCs w:val="22"/>
                 <w:lang w:val="es-ES"/>
@@ -2675,7 +2675,7 @@
               <w:jc w:val="left"/>
               <w:rPr>
                 <w:rFonts w:asciiTheme="minorHAnsi" w:eastAsia="Calibri" w:hAnsiTheme="minorHAnsi" w:cstheme="minorHAnsi"/>
-                <w:color w:val="000000" w:themeColor="text1"/>
+                <w:color w:val="000000"/>
                 <w:sz w:val="20"/>
                 <w:szCs w:val="22"/>
                 <w:lang w:val="es-ES"/>
@@ -2707,7 +2707,7 @@
               <w:jc w:val="left"/>
               <w:rPr>
                 <w:rFonts w:asciiTheme="minorHAnsi" w:eastAsia="Calibri" w:hAnsiTheme="minorHAnsi" w:cstheme="minorHAnsi"/>
-                <w:color w:val="000000" w:themeColor="text1"/>
+                <w:color w:val="000000"/>
                 <w:sz w:val="20"/>
                 <w:szCs w:val="22"/>
                 <w:lang w:val="es-ES"/>
@@ -3203,7 +3203,7 @@
               <w:jc w:val="left"/>
               <w:rPr>
                 <w:rFonts w:asciiTheme="minorHAnsi" w:eastAsia="PMingLiU" w:hAnsiTheme="minorHAnsi" w:cstheme="minorHAnsi"/>
-                <w:color w:val="000000" w:themeColor="text1"/>
+                <w:color w:val="000000"/>
                 <w:sz w:val="20"/>
                 <w:szCs w:val="22"/>
                 <w:lang w:val="es-ES"/>
@@ -3235,7 +3235,7 @@
               <w:jc w:val="left"/>
               <w:rPr>
                 <w:rFonts w:asciiTheme="minorHAnsi" w:hAnsiTheme="minorHAnsi" w:cstheme="minorHAnsi"/>
-                <w:color w:val="000000" w:themeColor="text1"/>
+                <w:color w:val="000000"/>
                 <w:sz w:val="20"/>
                 <w:szCs w:val="22"/>
                 <w:lang w:val="es-ES"/>
@@ -3325,7 +3325,7 @@
               <w:jc w:val="left"/>
               <w:rPr>
                 <w:rFonts w:asciiTheme="minorHAnsi" w:eastAsia="PMingLiU" w:hAnsiTheme="minorHAnsi" w:cstheme="minorHAnsi"/>
-                <w:color w:val="000000" w:themeColor="text1"/>
+                <w:color w:val="000000"/>
                 <w:sz w:val="20"/>
                 <w:szCs w:val="22"/>
                 <w:lang w:val="es-ES"/>
@@ -3356,7 +3356,7 @@
               <w:jc w:val="left"/>
               <w:rPr>
                 <w:rFonts w:asciiTheme="minorHAnsi" w:hAnsiTheme="minorHAnsi" w:cstheme="minorHAnsi"/>
-                <w:color w:val="000000" w:themeColor="text1"/>
+                <w:color w:val="000000"/>
                 <w:sz w:val="20"/>
                 <w:szCs w:val="22"/>
                 <w:lang w:val="es-ES"/>
@@ -3479,7 +3479,7 @@
               <w:jc w:val="left"/>
               <w:rPr>
                 <w:rFonts w:asciiTheme="minorHAnsi" w:eastAsia="PMingLiU" w:hAnsiTheme="minorHAnsi" w:cstheme="minorHAnsi"/>
-                <w:color w:val="000000" w:themeColor="text1"/>
+                <w:color w:val="000000"/>
                 <w:sz w:val="20"/>
                 <w:szCs w:val="22"/>
                 <w:lang w:val="es-ES"/>
@@ -3510,7 +3510,7 @@
               <w:jc w:val="left"/>
               <w:rPr>
                 <w:rFonts w:asciiTheme="minorHAnsi" w:hAnsiTheme="minorHAnsi" w:cstheme="minorHAnsi"/>
-                <w:color w:val="000000" w:themeColor="text1"/>
+                <w:color w:val="000000"/>
                 <w:sz w:val="20"/>
                 <w:szCs w:val="22"/>
                 <w:lang w:val="es-ES"/>
@@ -3608,7 +3608,7 @@
           <w:rFonts w:ascii="Calibri" w:eastAsia="SimSun" w:hAnsi="Calibri"/>
           <w:i/>
           <w:iCs/>
-          <w:color w:val="1B6FB5"/>
+          <w:color w:val="000000"/>
           <w:sz w:val="20"/>
           <w:lang w:val="es-ES" w:eastAsia="zh-CN"/>
         </w:rPr>
@@ -3629,7 +3629,7 @@
           <w:rFonts w:ascii="Calibri" w:eastAsia="SimSun" w:hAnsi="Calibri"/>
           <w:i/>
           <w:iCs/>
-          <w:color w:val="1B6FB5"/>
+          <w:color w:val="000000"/>
           <w:sz w:val="20"/>
           <w:lang w:val="es-ES" w:eastAsia="zh-CN"/>
         </w:rPr>
@@ -3643,7 +3643,7 @@
       </w:r>
       <w:r>
         <w:rPr>
-          <w:color w:val="0563C1"/>
+          <w:color w:val="000000"/>
           <w:u w:val="single"/>
           <w:lang w:val="es-ES"/>
         </w:rPr>
@@ -3658,7 +3658,7 @@
           <w:rFonts w:ascii="Calibri" w:eastAsia="SimSun" w:hAnsi="Calibri"/>
           <w:i/>
           <w:iCs/>
-          <w:color w:val="1B6FB5"/>
+          <w:color w:val="000000"/>
           <w:sz w:val="20"/>
           <w:lang w:val="es-ES" w:eastAsia="zh-CN"/>
         </w:rPr>
@@ -3700,7 +3700,7 @@
       </w:r>
       <w:r>
         <w:rPr>
-          <w:color w:val="0563C1"/>
+          <w:color w:val="000000"/>
           <w:u w:val="single"/>
           <w:lang w:val="es-ES"/>
         </w:rPr>
@@ -7251,7 +7251,7 @@
                 <w:rFonts w:asciiTheme="minorHAnsi" w:hAnsiTheme="minorHAnsi" w:cstheme="minorHAnsi"/>
                 <w:b/>
                 <w:i w:val="0"/>
-                <w:color w:val="000000" w:themeColor="text1"/>
+                <w:color w:val="000000"/>
                 <w:sz w:val="22"/>
                 <w:lang w:val="es-ES"/>
               </w:rPr>
@@ -7261,7 +7261,7 @@
                 <w:rFonts w:asciiTheme="minorHAnsi" w:hAnsiTheme="minorHAnsi" w:cstheme="minorHAnsi"/>
                 <w:b/>
                 <w:i w:val="0"/>
-                <w:color w:val="000000" w:themeColor="text1"/>
+                <w:color w:val="000000"/>
                 <w:sz w:val="22"/>
                 <w:lang w:val="es-ES"/>
               </w:rPr>
@@ -7283,7 +7283,7 @@
                 <w:rFonts w:asciiTheme="minorHAnsi" w:hAnsiTheme="minorHAnsi" w:cstheme="minorHAnsi"/>
                 <w:b/>
                 <w:i w:val="0"/>
-                <w:color w:val="000000" w:themeColor="text1"/>
+                <w:color w:val="000000"/>
                 <w:sz w:val="22"/>
                 <w:lang w:val="es-ES"/>
               </w:rPr>
@@ -7293,7 +7293,7 @@
                 <w:rFonts w:asciiTheme="minorHAnsi" w:hAnsiTheme="minorHAnsi" w:cstheme="minorHAnsi"/>
                 <w:b/>
                 <w:i w:val="0"/>
-                <w:color w:val="000000" w:themeColor="text1"/>
+                <w:color w:val="000000"/>
                 <w:sz w:val="22"/>
                 <w:lang w:val="es-ES"/>
               </w:rPr>
@@ -7315,7 +7315,7 @@
                 <w:rFonts w:asciiTheme="minorHAnsi" w:hAnsiTheme="minorHAnsi" w:cstheme="minorHAnsi"/>
                 <w:b/>
                 <w:i w:val="0"/>
-                <w:color w:val="000000" w:themeColor="text1"/>
+                <w:color w:val="000000"/>
                 <w:sz w:val="22"/>
                 <w:lang w:val="es-ES"/>
               </w:rPr>
@@ -7325,7 +7325,7 @@
                 <w:rFonts w:asciiTheme="minorHAnsi" w:hAnsiTheme="minorHAnsi" w:cstheme="minorHAnsi"/>
                 <w:b/>
                 <w:i w:val="0"/>
-                <w:color w:val="000000" w:themeColor="text1"/>
+                <w:color w:val="000000"/>
                 <w:sz w:val="22"/>
                 <w:lang w:val="es-ES"/>
               </w:rPr>
@@ -7336,7 +7336,7 @@
                 <w:rFonts w:asciiTheme="minorHAnsi" w:hAnsiTheme="minorHAnsi" w:cstheme="minorHAnsi"/>
                 <w:b/>
                 <w:i w:val="0"/>
-                <w:color w:val="000000" w:themeColor="text1"/>
+                <w:color w:val="000000"/>
                 <w:sz w:val="22"/>
                 <w:lang w:val="es-ES"/>
               </w:rPr>
@@ -7357,7 +7357,7 @@
               <w:jc w:val="both"/>
               <w:rPr>
                 <w:rFonts w:asciiTheme="minorHAnsi" w:hAnsiTheme="minorHAnsi" w:cstheme="minorHAnsi"/>
-                <w:color w:val="0070C0"/>
+                <w:color w:val="000000"/>
                 <w:sz w:val="20"/>
                 <w:lang w:val="es-ES"/>
               </w:rPr>
@@ -7382,7 +7382,7 @@
               <w:jc w:val="both"/>
               <w:rPr>
                 <w:rFonts w:asciiTheme="minorHAnsi" w:hAnsiTheme="minorHAnsi" w:cstheme="minorHAnsi"/>
-                <w:color w:val="0070C0"/>
+                <w:color w:val="000000"/>
                 <w:sz w:val="20"/>
                 <w:lang w:val="es-ES"/>
               </w:rPr>
@@ -7608,7 +7608,7 @@
               <w:jc w:val="both"/>
               <w:rPr>
                 <w:rFonts w:asciiTheme="minorHAnsi" w:hAnsiTheme="minorHAnsi" w:cstheme="minorHAnsi"/>
-                <w:color w:val="0070C0"/>
+                <w:color w:val="000000"/>
                 <w:sz w:val="20"/>
                 <w:lang w:val="es-ES"/>
               </w:rPr>
@@ -7635,7 +7635,7 @@
               <w:jc w:val="both"/>
               <w:rPr>
                 <w:rFonts w:asciiTheme="minorHAnsi" w:hAnsiTheme="minorHAnsi" w:cstheme="minorHAnsi"/>
-                <w:color w:val="0070C0"/>
+                <w:color w:val="000000"/>
                 <w:sz w:val="20"/>
                 <w:lang w:val="es-ES"/>
               </w:rPr>
@@ -7660,7 +7660,7 @@
               <w:jc w:val="both"/>
               <w:rPr>
                 <w:rFonts w:asciiTheme="minorHAnsi" w:hAnsiTheme="minorHAnsi" w:cstheme="minorHAnsi"/>
-                <w:color w:val="0070C0"/>
+                <w:color w:val="000000"/>
                 <w:sz w:val="20"/>
                 <w:lang w:val="es-ES"/>
               </w:rPr>
@@ -7870,7 +7870,7 @@
               <w:jc w:val="both"/>
               <w:rPr>
                 <w:rFonts w:asciiTheme="minorHAnsi" w:hAnsiTheme="minorHAnsi" w:cstheme="minorHAnsi"/>
-                <w:color w:val="0070C0"/>
+                <w:color w:val="000000"/>
                 <w:sz w:val="20"/>
                 <w:lang w:val="es-ES"/>
               </w:rPr>
@@ -7897,7 +7897,7 @@
               <w:jc w:val="both"/>
               <w:rPr>
                 <w:rFonts w:asciiTheme="minorHAnsi" w:hAnsiTheme="minorHAnsi" w:cstheme="minorHAnsi"/>
-                <w:color w:val="0070C0"/>
+                <w:color w:val="000000"/>
                 <w:sz w:val="20"/>
                 <w:lang w:val="es-ES"/>
               </w:rPr>
@@ -7922,7 +7922,7 @@
               <w:jc w:val="both"/>
               <w:rPr>
                 <w:rFonts w:asciiTheme="minorHAnsi" w:hAnsiTheme="minorHAnsi" w:cstheme="minorHAnsi"/>
-                <w:color w:val="0070C0"/>
+                <w:color w:val="000000"/>
                 <w:sz w:val="20"/>
                 <w:lang w:val="es-ES"/>
               </w:rPr>
@@ -8084,7 +8084,7 @@
               <w:jc w:val="both"/>
               <w:rPr>
                 <w:rFonts w:asciiTheme="minorHAnsi" w:hAnsiTheme="minorHAnsi" w:cstheme="minorHAnsi"/>
-                <w:color w:val="0070C0"/>
+                <w:color w:val="000000"/>
                 <w:sz w:val="20"/>
                 <w:lang w:val="es-ES"/>
               </w:rPr>
@@ -8111,7 +8111,7 @@
               <w:jc w:val="both"/>
               <w:rPr>
                 <w:rFonts w:asciiTheme="minorHAnsi" w:hAnsiTheme="minorHAnsi" w:cstheme="minorHAnsi"/>
-                <w:color w:val="0070C0"/>
+                <w:color w:val="000000"/>
                 <w:sz w:val="20"/>
                 <w:lang w:val="es-ES"/>
               </w:rPr>
@@ -8136,7 +8136,7 @@
               <w:jc w:val="both"/>
               <w:rPr>
                 <w:rFonts w:asciiTheme="minorHAnsi" w:hAnsiTheme="minorHAnsi" w:cstheme="minorHAnsi"/>
-                <w:color w:val="0070C0"/>
+                <w:color w:val="000000"/>
                 <w:sz w:val="20"/>
                 <w:lang w:val="es-ES"/>
               </w:rPr>
@@ -8314,7 +8314,7 @@
               <w:jc w:val="both"/>
               <w:rPr>
                 <w:rFonts w:asciiTheme="minorHAnsi" w:hAnsiTheme="minorHAnsi" w:cstheme="minorHAnsi"/>
-                <w:color w:val="0070C0"/>
+                <w:color w:val="000000"/>
                 <w:sz w:val="20"/>
                 <w:lang w:val="es-ES"/>
               </w:rPr>
@@ -8341,7 +8341,7 @@
               <w:jc w:val="both"/>
               <w:rPr>
                 <w:rFonts w:asciiTheme="minorHAnsi" w:hAnsiTheme="minorHAnsi" w:cstheme="minorHAnsi"/>
-                <w:color w:val="0070C0"/>
+                <w:color w:val="000000"/>
                 <w:sz w:val="20"/>
                 <w:lang w:val="es-ES"/>
               </w:rPr>
@@ -8366,7 +8366,7 @@
               <w:jc w:val="both"/>
               <w:rPr>
                 <w:rFonts w:asciiTheme="minorHAnsi" w:hAnsiTheme="minorHAnsi" w:cstheme="minorHAnsi"/>
-                <w:color w:val="0070C0"/>
+                <w:color w:val="000000"/>
                 <w:sz w:val="20"/>
                 <w:lang w:val="es-ES"/>
               </w:rPr>
@@ -8391,7 +8391,7 @@
               <w:jc w:val="both"/>
               <w:rPr>
                 <w:rFonts w:asciiTheme="minorHAnsi" w:hAnsiTheme="minorHAnsi" w:cstheme="minorHAnsi"/>
-                <w:color w:val="0070C0"/>
+                <w:color w:val="000000"/>
                 <w:sz w:val="20"/>
                 <w:lang w:val="es-ES"/>
               </w:rPr>
@@ -8418,7 +8418,7 @@
               <w:jc w:val="both"/>
               <w:rPr>
                 <w:rFonts w:asciiTheme="minorHAnsi" w:hAnsiTheme="minorHAnsi" w:cstheme="minorHAnsi"/>
-                <w:color w:val="0070C0"/>
+                <w:color w:val="000000"/>
                 <w:sz w:val="20"/>
                 <w:lang w:val="es-ES"/>
               </w:rPr>
@@ -8443,7 +8443,7 @@
               <w:jc w:val="both"/>
               <w:rPr>
                 <w:rFonts w:asciiTheme="minorHAnsi" w:hAnsiTheme="minorHAnsi" w:cstheme="minorHAnsi"/>
-                <w:color w:val="0070C0"/>
+                <w:color w:val="000000"/>
                 <w:sz w:val="20"/>
                 <w:lang w:val="es-ES"/>
               </w:rPr>
@@ -8637,7 +8637,7 @@
               <w:jc w:val="both"/>
               <w:rPr>
                 <w:rFonts w:asciiTheme="minorHAnsi" w:hAnsiTheme="minorHAnsi" w:cstheme="minorHAnsi"/>
-                <w:color w:val="0070C0"/>
+                <w:color w:val="000000"/>
                 <w:sz w:val="20"/>
                 <w:lang w:val="es-ES"/>
               </w:rPr>
@@ -8664,7 +8664,7 @@
               <w:jc w:val="both"/>
               <w:rPr>
                 <w:rFonts w:asciiTheme="minorHAnsi" w:hAnsiTheme="minorHAnsi" w:cstheme="minorHAnsi"/>
-                <w:color w:val="0070C0"/>
+                <w:color w:val="000000"/>
                 <w:sz w:val="20"/>
                 <w:lang w:val="es-ES"/>
               </w:rPr>
@@ -8689,7 +8689,7 @@
               <w:jc w:val="both"/>
               <w:rPr>
                 <w:rFonts w:asciiTheme="minorHAnsi" w:hAnsiTheme="minorHAnsi" w:cstheme="minorHAnsi"/>
-                <w:color w:val="0070C0"/>
+                <w:color w:val="000000"/>
                 <w:sz w:val="20"/>
                 <w:lang w:val="es-ES"/>
               </w:rPr>
@@ -8851,7 +8851,7 @@
               <w:jc w:val="both"/>
               <w:rPr>
                 <w:rFonts w:asciiTheme="minorHAnsi" w:hAnsiTheme="minorHAnsi" w:cstheme="minorHAnsi"/>
-                <w:color w:val="0070C0"/>
+                <w:color w:val="000000"/>
                 <w:sz w:val="20"/>
                 <w:lang w:val="es-ES"/>
               </w:rPr>
@@ -8925,7 +8925,7 @@
                 <w:rFonts w:asciiTheme="minorHAnsi" w:hAnsiTheme="minorHAnsi" w:cstheme="minorHAnsi"/>
                 <w:b/>
                 <w:i w:val="0"/>
-                <w:color w:val="000000" w:themeColor="text1"/>
+                <w:color w:val="000000"/>
                 <w:sz w:val="22"/>
                 <w:lang w:val="es-ES"/>
               </w:rPr>
@@ -8935,7 +8935,7 @@
                 <w:rFonts w:asciiTheme="minorHAnsi" w:hAnsiTheme="minorHAnsi" w:cstheme="minorHAnsi"/>
                 <w:b/>
                 <w:i w:val="0"/>
-                <w:color w:val="000000" w:themeColor="text1"/>
+                <w:color w:val="000000"/>
                 <w:sz w:val="22"/>
                 <w:lang w:val="es-ES"/>
               </w:rPr>
@@ -8957,7 +8957,7 @@
                 <w:rFonts w:asciiTheme="minorHAnsi" w:hAnsiTheme="minorHAnsi" w:cstheme="minorHAnsi"/>
                 <w:b/>
                 <w:i w:val="0"/>
-                <w:color w:val="000000" w:themeColor="text1"/>
+                <w:color w:val="000000"/>
                 <w:sz w:val="22"/>
                 <w:lang w:val="es-ES"/>
               </w:rPr>
@@ -8967,7 +8967,7 @@
                 <w:rFonts w:asciiTheme="minorHAnsi" w:hAnsiTheme="minorHAnsi" w:cstheme="minorHAnsi"/>
                 <w:b/>
                 <w:i w:val="0"/>
-                <w:color w:val="000000" w:themeColor="text1"/>
+                <w:color w:val="000000"/>
                 <w:sz w:val="22"/>
                 <w:lang w:val="es-ES"/>
               </w:rPr>
@@ -8989,7 +8989,7 @@
                 <w:rFonts w:asciiTheme="minorHAnsi" w:hAnsiTheme="minorHAnsi" w:cstheme="minorHAnsi"/>
                 <w:b/>
                 <w:i w:val="0"/>
-                <w:color w:val="000000" w:themeColor="text1"/>
+                <w:color w:val="000000"/>
                 <w:sz w:val="22"/>
                 <w:lang w:val="es-ES"/>
               </w:rPr>
@@ -8999,7 +8999,7 @@
                 <w:rFonts w:asciiTheme="minorHAnsi" w:hAnsiTheme="minorHAnsi" w:cstheme="minorHAnsi"/>
                 <w:b/>
                 <w:i w:val="0"/>
-                <w:color w:val="000000" w:themeColor="text1"/>
+                <w:color w:val="000000"/>
                 <w:sz w:val="22"/>
                 <w:lang w:val="es-ES"/>
               </w:rPr>
@@ -9020,7 +9020,7 @@
               <w:jc w:val="both"/>
               <w:rPr>
                 <w:rFonts w:asciiTheme="minorHAnsi" w:hAnsiTheme="minorHAnsi" w:cstheme="minorHAnsi"/>
-                <w:color w:val="0070C0"/>
+                <w:color w:val="000000"/>
                 <w:sz w:val="20"/>
                 <w:lang w:val="es-ES"/>
               </w:rPr>
@@ -9045,7 +9045,7 @@
               <w:jc w:val="both"/>
               <w:rPr>
                 <w:rFonts w:asciiTheme="minorHAnsi" w:hAnsiTheme="minorHAnsi" w:cstheme="minorHAnsi"/>
-                <w:color w:val="0070C0"/>
+                <w:color w:val="000000"/>
                 <w:sz w:val="20"/>
                 <w:lang w:val="es-ES"/>
               </w:rPr>
@@ -9088,7 +9088,7 @@
               <w:jc w:val="both"/>
               <w:rPr>
                 <w:rFonts w:asciiTheme="minorHAnsi" w:hAnsiTheme="minorHAnsi" w:cstheme="minorHAnsi"/>
-                <w:color w:val="0070C0"/>
+                <w:color w:val="000000"/>
                 <w:sz w:val="20"/>
                 <w:lang w:val="es-ES"/>
               </w:rPr>
@@ -9179,7 +9179,7 @@
               <w:jc w:val="both"/>
               <w:rPr>
                 <w:rFonts w:asciiTheme="minorHAnsi" w:hAnsiTheme="minorHAnsi" w:cstheme="minorHAnsi"/>
-                <w:color w:val="0070C0"/>
+                <w:color w:val="000000"/>
                 <w:sz w:val="20"/>
                 <w:lang w:val="es-ES"/>
               </w:rPr>
@@ -9204,7 +9204,7 @@
               <w:jc w:val="both"/>
               <w:rPr>
                 <w:rFonts w:asciiTheme="minorHAnsi" w:hAnsiTheme="minorHAnsi" w:cstheme="minorHAnsi"/>
-                <w:color w:val="0070C0"/>
+                <w:color w:val="000000"/>
                 <w:sz w:val="20"/>
                 <w:lang w:val="es-ES"/>
               </w:rPr>
@@ -9238,7 +9238,7 @@
               <w:jc w:val="both"/>
               <w:rPr>
                 <w:rFonts w:asciiTheme="minorHAnsi" w:hAnsiTheme="minorHAnsi" w:cstheme="minorHAnsi"/>
-                <w:color w:val="0070C0"/>
+                <w:color w:val="000000"/>
                 <w:sz w:val="20"/>
                 <w:lang w:val="es-ES"/>
               </w:rPr>
@@ -9377,7 +9377,7 @@
               <w:jc w:val="both"/>
               <w:rPr>
                 <w:rFonts w:asciiTheme="minorHAnsi" w:hAnsiTheme="minorHAnsi" w:cstheme="minorHAnsi"/>
-                <w:color w:val="0070C0"/>
+                <w:color w:val="000000"/>
                 <w:sz w:val="20"/>
                 <w:lang w:val="es-ES"/>
               </w:rPr>
@@ -9402,7 +9402,7 @@
               <w:jc w:val="both"/>
               <w:rPr>
                 <w:rFonts w:asciiTheme="minorHAnsi" w:hAnsiTheme="minorHAnsi" w:cstheme="minorHAnsi"/>
-                <w:color w:val="0070C0"/>
+                <w:color w:val="000000"/>
                 <w:sz w:val="20"/>
                 <w:lang w:val="es-ES"/>
               </w:rPr>
@@ -9468,7 +9468,7 @@
               <w:jc w:val="both"/>
               <w:rPr>
                 <w:rFonts w:asciiTheme="minorHAnsi" w:hAnsiTheme="minorHAnsi" w:cstheme="minorHAnsi"/>
-                <w:color w:val="0070C0"/>
+                <w:color w:val="000000"/>
                 <w:sz w:val="20"/>
                 <w:lang w:val="es-ES"/>
               </w:rPr>
@@ -9655,7 +9655,7 @@
               <w:jc w:val="both"/>
               <w:rPr>
                 <w:rFonts w:asciiTheme="minorHAnsi" w:hAnsiTheme="minorHAnsi" w:cstheme="minorHAnsi"/>
-                <w:color w:val="0070C0"/>
+                <w:color w:val="000000"/>
                 <w:sz w:val="20"/>
                 <w:lang w:val="es-ES"/>
               </w:rPr>
@@ -9680,7 +9680,7 @@
               <w:jc w:val="both"/>
               <w:rPr>
                 <w:rFonts w:asciiTheme="minorHAnsi" w:hAnsiTheme="minorHAnsi" w:cstheme="minorHAnsi"/>
-                <w:color w:val="0070C0"/>
+                <w:color w:val="000000"/>
                 <w:sz w:val="20"/>
                 <w:lang w:val="es-ES"/>
               </w:rPr>
@@ -9730,7 +9730,7 @@
               <w:jc w:val="both"/>
               <w:rPr>
                 <w:rFonts w:asciiTheme="minorHAnsi" w:hAnsiTheme="minorHAnsi" w:cstheme="minorHAnsi"/>
-                <w:color w:val="0070C0"/>
+                <w:color w:val="000000"/>
                 <w:sz w:val="20"/>
                 <w:lang w:val="es-ES"/>
               </w:rPr>
@@ -9926,7 +9926,7 @@
               <w:jc w:val="both"/>
               <w:rPr>
                 <w:rFonts w:asciiTheme="minorHAnsi" w:hAnsiTheme="minorHAnsi" w:cstheme="minorHAnsi"/>
-                <w:color w:val="0070C0"/>
+                <w:color w:val="000000"/>
                 <w:sz w:val="20"/>
                 <w:lang w:val="es-ES"/>
               </w:rPr>
@@ -9951,7 +9951,7 @@
               <w:jc w:val="both"/>
               <w:rPr>
                 <w:rFonts w:asciiTheme="minorHAnsi" w:hAnsiTheme="minorHAnsi" w:cstheme="minorHAnsi"/>
-                <w:color w:val="0070C0"/>
+                <w:color w:val="000000"/>
                 <w:sz w:val="20"/>
                 <w:lang w:val="es-ES"/>
               </w:rPr>
@@ -9994,7 +9994,7 @@
               <w:jc w:val="both"/>
               <w:rPr>
                 <w:rFonts w:asciiTheme="minorHAnsi" w:hAnsiTheme="minorHAnsi" w:cstheme="minorHAnsi"/>
-                <w:color w:val="0070C0"/>
+                <w:color w:val="000000"/>
                 <w:sz w:val="20"/>
                 <w:lang w:val="es-ES"/>
               </w:rPr>
@@ -10206,7 +10206,7 @@
               <w:jc w:val="both"/>
               <w:rPr>
                 <w:rFonts w:asciiTheme="minorHAnsi" w:hAnsiTheme="minorHAnsi" w:cstheme="minorHAnsi"/>
-                <w:color w:val="0070C0"/>
+                <w:color w:val="000000"/>
                 <w:sz w:val="20"/>
                 <w:lang w:val="es-ES"/>
               </w:rPr>
@@ -10231,7 +10231,7 @@
               <w:jc w:val="both"/>
               <w:rPr>
                 <w:rFonts w:asciiTheme="minorHAnsi" w:hAnsiTheme="minorHAnsi" w:cstheme="minorHAnsi"/>
-                <w:color w:val="0070C0"/>
+                <w:color w:val="000000"/>
                 <w:sz w:val="20"/>
                 <w:lang w:val="es-ES"/>
               </w:rPr>
@@ -10265,7 +10265,7 @@
               <w:jc w:val="both"/>
               <w:rPr>
                 <w:rFonts w:asciiTheme="minorHAnsi" w:hAnsiTheme="minorHAnsi" w:cstheme="minorHAnsi"/>
-                <w:color w:val="0070C0"/>
+                <w:color w:val="000000"/>
                 <w:sz w:val="20"/>
                 <w:lang w:val="es-ES"/>
               </w:rPr>
@@ -10461,7 +10461,7 @@
               <w:jc w:val="both"/>
               <w:rPr>
                 <w:rFonts w:asciiTheme="minorHAnsi" w:hAnsiTheme="minorHAnsi" w:cstheme="minorHAnsi"/>
-                <w:color w:val="0070C0"/>
+                <w:color w:val="000000"/>
                 <w:sz w:val="20"/>
                 <w:lang w:val="es-ES"/>
               </w:rPr>
@@ -10486,7 +10486,7 @@
               <w:jc w:val="both"/>
               <w:rPr>
                 <w:rFonts w:asciiTheme="minorHAnsi" w:hAnsiTheme="minorHAnsi" w:cstheme="minorHAnsi"/>
-                <w:color w:val="0070C0"/>
+                <w:color w:val="000000"/>
                 <w:sz w:val="20"/>
                 <w:lang w:val="es-ES"/>
               </w:rPr>
@@ -10520,7 +10520,7 @@
               <w:jc w:val="both"/>
               <w:rPr>
                 <w:rFonts w:asciiTheme="minorHAnsi" w:hAnsiTheme="minorHAnsi" w:cstheme="minorHAnsi"/>
-                <w:color w:val="0070C0"/>
+                <w:color w:val="000000"/>
                 <w:sz w:val="20"/>
                 <w:lang w:val="es-ES"/>
               </w:rPr>
@@ -10707,7 +10707,7 @@
               <w:jc w:val="both"/>
               <w:rPr>
                 <w:rFonts w:asciiTheme="minorHAnsi" w:hAnsiTheme="minorHAnsi" w:cstheme="minorHAnsi"/>
-                <w:color w:val="0070C0"/>
+                <w:color w:val="000000"/>
                 <w:sz w:val="20"/>
                 <w:lang w:val="es-ES"/>
               </w:rPr>
@@ -10732,7 +10732,7 @@
               <w:jc w:val="both"/>
               <w:rPr>
                 <w:rFonts w:asciiTheme="minorHAnsi" w:hAnsiTheme="minorHAnsi" w:cstheme="minorHAnsi"/>
-                <w:color w:val="0070C0"/>
+                <w:color w:val="000000"/>
                 <w:sz w:val="20"/>
                 <w:lang w:val="es-ES"/>
               </w:rPr>
@@ -10757,7 +10757,7 @@
               <w:jc w:val="both"/>
               <w:rPr>
                 <w:rFonts w:asciiTheme="minorHAnsi" w:hAnsiTheme="minorHAnsi" w:cstheme="minorHAnsi"/>
-                <w:color w:val="0070C0"/>
+                <w:color w:val="000000"/>
                 <w:sz w:val="20"/>
                 <w:lang w:val="es-ES"/>
               </w:rPr>
@@ -10784,7 +10784,7 @@
               <w:jc w:val="both"/>
               <w:rPr>
                 <w:rFonts w:asciiTheme="minorHAnsi" w:hAnsiTheme="minorHAnsi" w:cstheme="minorHAnsi"/>
-                <w:color w:val="0070C0"/>
+                <w:color w:val="000000"/>
                 <w:sz w:val="20"/>
                 <w:lang w:val="es-ES"/>
               </w:rPr>
@@ -10809,7 +10809,7 @@
               <w:jc w:val="both"/>
               <w:rPr>
                 <w:rFonts w:asciiTheme="minorHAnsi" w:hAnsiTheme="minorHAnsi" w:cstheme="minorHAnsi"/>
-                <w:color w:val="0070C0"/>
+                <w:color w:val="000000"/>
                 <w:sz w:val="20"/>
                 <w:lang w:val="es-ES"/>
               </w:rPr>
@@ -10859,7 +10859,7 @@
               <w:jc w:val="both"/>
               <w:rPr>
                 <w:rFonts w:asciiTheme="minorHAnsi" w:hAnsiTheme="minorHAnsi" w:cstheme="minorHAnsi"/>
-                <w:color w:val="0070C0"/>
+                <w:color w:val="000000"/>
                 <w:sz w:val="20"/>
                 <w:lang w:val="es-ES"/>
               </w:rPr>
@@ -11030,7 +11030,7 @@
               <w:jc w:val="both"/>
               <w:rPr>
                 <w:rFonts w:asciiTheme="minorHAnsi" w:hAnsiTheme="minorHAnsi" w:cstheme="minorHAnsi"/>
-                <w:color w:val="0070C0"/>
+                <w:color w:val="000000"/>
                 <w:sz w:val="20"/>
                 <w:lang w:val="es-ES"/>
               </w:rPr>
@@ -11055,7 +11055,7 @@
               <w:jc w:val="both"/>
               <w:rPr>
                 <w:rFonts w:asciiTheme="minorHAnsi" w:hAnsiTheme="minorHAnsi" w:cstheme="minorHAnsi"/>
-                <w:color w:val="0070C0"/>
+                <w:color w:val="000000"/>
                 <w:sz w:val="20"/>
                 <w:lang w:val="es-ES"/>
               </w:rPr>
@@ -11089,7 +11089,7 @@
               <w:jc w:val="both"/>
               <w:rPr>
                 <w:rFonts w:asciiTheme="minorHAnsi" w:hAnsiTheme="minorHAnsi" w:cstheme="minorHAnsi"/>
-                <w:color w:val="0070C0"/>
+                <w:color w:val="000000"/>
                 <w:sz w:val="20"/>
                 <w:lang w:val="es-ES"/>
               </w:rPr>
@@ -11253,7 +11253,7 @@
               <w:jc w:val="both"/>
               <w:rPr>
                 <w:rFonts w:asciiTheme="minorHAnsi" w:hAnsiTheme="minorHAnsi" w:cstheme="minorHAnsi"/>
-                <w:color w:val="0070C0"/>
+                <w:color w:val="000000"/>
                 <w:sz w:val="20"/>
                 <w:lang w:val="es-ES"/>
               </w:rPr>
@@ -11278,7 +11278,7 @@
               <w:jc w:val="both"/>
               <w:rPr>
                 <w:rFonts w:asciiTheme="minorHAnsi" w:hAnsiTheme="minorHAnsi" w:cstheme="minorHAnsi"/>
-                <w:color w:val="0070C0"/>
+                <w:color w:val="000000"/>
                 <w:sz w:val="20"/>
                 <w:lang w:val="es-ES"/>
               </w:rPr>
@@ -11321,7 +11321,7 @@
               <w:jc w:val="both"/>
               <w:rPr>
                 <w:rFonts w:asciiTheme="minorHAnsi" w:hAnsiTheme="minorHAnsi" w:cstheme="minorHAnsi"/>
-                <w:color w:val="0070C0"/>
+                <w:color w:val="000000"/>
                 <w:sz w:val="20"/>
                 <w:lang w:val="es-ES"/>
               </w:rPr>
@@ -11506,7 +11506,7 @@
                 <w:rFonts w:asciiTheme="minorHAnsi" w:hAnsiTheme="minorHAnsi" w:cstheme="minorHAnsi"/>
                 <w:b/>
                 <w:i w:val="0"/>
-                <w:color w:val="000000" w:themeColor="text1"/>
+                <w:color w:val="000000"/>
                 <w:sz w:val="22"/>
                 <w:lang w:val="es-ES"/>
               </w:rPr>
@@ -11516,7 +11516,7 @@
                 <w:rFonts w:asciiTheme="minorHAnsi" w:hAnsiTheme="minorHAnsi" w:cstheme="minorHAnsi"/>
                 <w:b/>
                 <w:i w:val="0"/>
-                <w:color w:val="000000" w:themeColor="text1"/>
+                <w:color w:val="000000"/>
                 <w:sz w:val="22"/>
                 <w:lang w:val="es-ES"/>
               </w:rPr>
@@ -11538,7 +11538,7 @@
                 <w:rFonts w:asciiTheme="minorHAnsi" w:hAnsiTheme="minorHAnsi" w:cstheme="minorHAnsi"/>
                 <w:b/>
                 <w:i w:val="0"/>
-                <w:color w:val="000000" w:themeColor="text1"/>
+                <w:color w:val="000000"/>
                 <w:sz w:val="22"/>
                 <w:lang w:val="es-ES"/>
               </w:rPr>
@@ -11548,7 +11548,7 @@
                 <w:rFonts w:asciiTheme="minorHAnsi" w:hAnsiTheme="minorHAnsi" w:cstheme="minorHAnsi"/>
                 <w:b/>
                 <w:i w:val="0"/>
-                <w:color w:val="000000" w:themeColor="text1"/>
+                <w:color w:val="000000"/>
                 <w:sz w:val="22"/>
                 <w:lang w:val="es-ES"/>
               </w:rPr>
@@ -11570,7 +11570,7 @@
                 <w:rFonts w:asciiTheme="minorHAnsi" w:hAnsiTheme="minorHAnsi" w:cstheme="minorHAnsi"/>
                 <w:b/>
                 <w:i w:val="0"/>
-                <w:color w:val="000000" w:themeColor="text1"/>
+                <w:color w:val="000000"/>
                 <w:sz w:val="22"/>
                 <w:lang w:val="es-ES"/>
               </w:rPr>
@@ -11580,7 +11580,7 @@
                 <w:rFonts w:asciiTheme="minorHAnsi" w:hAnsiTheme="minorHAnsi" w:cstheme="minorHAnsi"/>
                 <w:b/>
                 <w:i w:val="0"/>
-                <w:color w:val="000000" w:themeColor="text1"/>
+                <w:color w:val="000000"/>
                 <w:sz w:val="22"/>
                 <w:lang w:val="es-ES"/>
               </w:rPr>
@@ -11600,7 +11600,7 @@
               <w:ind w:left="0"/>
               <w:rPr>
                 <w:rFonts w:asciiTheme="minorHAnsi" w:hAnsiTheme="minorHAnsi" w:cstheme="minorHAnsi"/>
-                <w:color w:val="0070C0"/>
+                <w:color w:val="000000"/>
                 <w:sz w:val="20"/>
                 <w:lang w:val="es-ES"/>
               </w:rPr>
@@ -11625,7 +11625,7 @@
               <w:jc w:val="both"/>
               <w:rPr>
                 <w:rFonts w:asciiTheme="minorHAnsi" w:hAnsiTheme="minorHAnsi" w:cstheme="minorHAnsi"/>
-                <w:color w:val="0070C0"/>
+                <w:color w:val="000000"/>
                 <w:sz w:val="20"/>
                 <w:lang w:val="es-ES"/>
               </w:rPr>
@@ -11755,7 +11755,7 @@
               <w:jc w:val="both"/>
               <w:rPr>
                 <w:rFonts w:asciiTheme="minorHAnsi" w:hAnsiTheme="minorHAnsi" w:cstheme="minorHAnsi"/>
-                <w:color w:val="0070C0"/>
+                <w:color w:val="000000"/>
                 <w:sz w:val="20"/>
                 <w:lang w:val="es-ES"/>
               </w:rPr>
@@ -11782,7 +11782,7 @@
               <w:jc w:val="both"/>
               <w:rPr>
                 <w:rFonts w:asciiTheme="minorHAnsi" w:hAnsiTheme="minorHAnsi" w:cstheme="minorHAnsi"/>
-                <w:color w:val="0070C0"/>
+                <w:color w:val="000000"/>
                 <w:sz w:val="20"/>
                 <w:lang w:val="es-ES"/>
               </w:rPr>
@@ -11807,7 +11807,7 @@
               <w:jc w:val="both"/>
               <w:rPr>
                 <w:rFonts w:asciiTheme="minorHAnsi" w:hAnsiTheme="minorHAnsi" w:cstheme="minorHAnsi"/>
-                <w:color w:val="0070C0"/>
+                <w:color w:val="000000"/>
                 <w:sz w:val="20"/>
                 <w:lang w:val="es-ES"/>
               </w:rPr>
@@ -11832,7 +11832,7 @@
               <w:jc w:val="both"/>
               <w:rPr>
                 <w:rFonts w:asciiTheme="minorHAnsi" w:hAnsiTheme="minorHAnsi" w:cstheme="minorHAnsi"/>
-                <w:color w:val="0070C0"/>
+                <w:color w:val="000000"/>
                 <w:sz w:val="20"/>
                 <w:lang w:val="es-ES"/>
               </w:rPr>
@@ -11859,7 +11859,7 @@
               <w:jc w:val="both"/>
               <w:rPr>
                 <w:rFonts w:asciiTheme="minorHAnsi" w:hAnsiTheme="minorHAnsi" w:cstheme="minorHAnsi"/>
-                <w:color w:val="0070C0"/>
+                <w:color w:val="000000"/>
                 <w:sz w:val="20"/>
                 <w:lang w:val="es-ES"/>
               </w:rPr>
@@ -11884,7 +11884,7 @@
               <w:jc w:val="both"/>
               <w:rPr>
                 <w:rFonts w:asciiTheme="minorHAnsi" w:hAnsiTheme="minorHAnsi" w:cstheme="minorHAnsi"/>
-                <w:color w:val="0070C0"/>
+                <w:color w:val="000000"/>
                 <w:sz w:val="20"/>
                 <w:lang w:val="es-ES"/>
               </w:rPr>
@@ -12022,7 +12022,7 @@
               <w:jc w:val="both"/>
               <w:rPr>
                 <w:rFonts w:asciiTheme="minorHAnsi" w:hAnsiTheme="minorHAnsi" w:cstheme="minorHAnsi"/>
-                <w:color w:val="0070C0"/>
+                <w:color w:val="000000"/>
                 <w:sz w:val="20"/>
                 <w:lang w:val="es-ES"/>
               </w:rPr>
@@ -12050,7 +12050,7 @@
               <w:jc w:val="both"/>
               <w:rPr>
                 <w:rFonts w:asciiTheme="minorHAnsi" w:hAnsiTheme="minorHAnsi" w:cstheme="minorHAnsi"/>
-                <w:color w:val="0070C0"/>
+                <w:color w:val="000000"/>
                 <w:sz w:val="20"/>
                 <w:lang w:val="es-ES"/>
               </w:rPr>
@@ -12075,7 +12075,7 @@
               <w:jc w:val="both"/>
               <w:rPr>
                 <w:rFonts w:asciiTheme="minorHAnsi" w:hAnsiTheme="minorHAnsi" w:cstheme="minorHAnsi"/>
-                <w:color w:val="0070C0"/>
+                <w:color w:val="000000"/>
                 <w:sz w:val="20"/>
                 <w:lang w:val="es-ES"/>
               </w:rPr>
@@ -12173,7 +12173,7 @@
               <w:jc w:val="both"/>
               <w:rPr>
                 <w:rFonts w:asciiTheme="minorHAnsi" w:hAnsiTheme="minorHAnsi" w:cstheme="minorHAnsi"/>
-                <w:color w:val="0070C0"/>
+                <w:color w:val="000000"/>
                 <w:sz w:val="20"/>
                 <w:lang w:val="es-ES"/>
               </w:rPr>
@@ -12200,7 +12200,7 @@
               <w:jc w:val="both"/>
               <w:rPr>
                 <w:rFonts w:asciiTheme="minorHAnsi" w:hAnsiTheme="minorHAnsi" w:cstheme="minorHAnsi"/>
-                <w:color w:val="0070C0"/>
+                <w:color w:val="000000"/>
                 <w:sz w:val="20"/>
                 <w:lang w:val="es-ES"/>
               </w:rPr>
@@ -12225,7 +12225,7 @@
               <w:jc w:val="both"/>
               <w:rPr>
                 <w:rFonts w:asciiTheme="minorHAnsi" w:hAnsiTheme="minorHAnsi" w:cstheme="minorHAnsi"/>
-                <w:color w:val="0070C0"/>
+                <w:color w:val="000000"/>
                 <w:sz w:val="20"/>
                 <w:lang w:val="es-ES"/>
               </w:rPr>
@@ -12314,7 +12314,7 @@
               <w:jc w:val="both"/>
               <w:rPr>
                 <w:rFonts w:asciiTheme="minorHAnsi" w:hAnsiTheme="minorHAnsi" w:cstheme="minorHAnsi"/>
-                <w:color w:val="0070C0"/>
+                <w:color w:val="000000"/>
                 <w:sz w:val="20"/>
                 <w:lang w:val="es-ES"/>
               </w:rPr>
@@ -12341,7 +12341,7 @@
               <w:jc w:val="both"/>
               <w:rPr>
                 <w:rFonts w:asciiTheme="minorHAnsi" w:hAnsiTheme="minorHAnsi" w:cstheme="minorHAnsi"/>
-                <w:color w:val="0070C0"/>
+                <w:color w:val="000000"/>
                 <w:sz w:val="20"/>
                 <w:lang w:val="es-ES"/>
               </w:rPr>
@@ -12366,7 +12366,7 @@
               <w:jc w:val="both"/>
               <w:rPr>
                 <w:rFonts w:asciiTheme="minorHAnsi" w:hAnsiTheme="minorHAnsi" w:cstheme="minorHAnsi"/>
-                <w:color w:val="0070C0"/>
+                <w:color w:val="000000"/>
                 <w:sz w:val="20"/>
                 <w:lang w:val="es-ES"/>
               </w:rPr>
@@ -12448,7 +12448,7 @@
               <w:jc w:val="both"/>
               <w:rPr>
                 <w:rFonts w:asciiTheme="minorHAnsi" w:hAnsiTheme="minorHAnsi" w:cstheme="minorHAnsi"/>
-                <w:color w:val="0070C0"/>
+                <w:color w:val="000000"/>
                 <w:sz w:val="20"/>
                 <w:lang w:val="es-ES"/>
               </w:rPr>
@@ -12475,7 +12475,7 @@
               <w:jc w:val="both"/>
               <w:rPr>
                 <w:rFonts w:asciiTheme="minorHAnsi" w:hAnsiTheme="minorHAnsi" w:cstheme="minorHAnsi"/>
-                <w:color w:val="0070C0"/>
+                <w:color w:val="000000"/>
                 <w:sz w:val="20"/>
                 <w:lang w:val="es-ES"/>
               </w:rPr>
@@ -12500,7 +12500,7 @@
               <w:jc w:val="both"/>
               <w:rPr>
                 <w:rFonts w:asciiTheme="minorHAnsi" w:hAnsiTheme="minorHAnsi" w:cstheme="minorHAnsi"/>
-                <w:color w:val="0070C0"/>
+                <w:color w:val="000000"/>
                 <w:sz w:val="20"/>
                 <w:lang w:val="es-ES"/>
               </w:rPr>
@@ -12646,7 +12646,7 @@
               <w:jc w:val="both"/>
               <w:rPr>
                 <w:rFonts w:asciiTheme="minorHAnsi" w:hAnsiTheme="minorHAnsi" w:cstheme="minorHAnsi"/>
-                <w:color w:val="0070C0"/>
+                <w:color w:val="000000"/>
                 <w:sz w:val="20"/>
                 <w:lang w:val="es-ES"/>
               </w:rPr>
@@ -12673,7 +12673,7 @@
               <w:jc w:val="both"/>
               <w:rPr>
                 <w:rFonts w:asciiTheme="minorHAnsi" w:hAnsiTheme="minorHAnsi" w:cstheme="minorHAnsi"/>
-                <w:color w:val="0070C0"/>
+                <w:color w:val="000000"/>
                 <w:sz w:val="20"/>
                 <w:lang w:val="es-ES"/>
               </w:rPr>
@@ -12698,7 +12698,7 @@
               <w:jc w:val="both"/>
               <w:rPr>
                 <w:rFonts w:asciiTheme="minorHAnsi" w:hAnsiTheme="minorHAnsi" w:cstheme="minorHAnsi"/>
-                <w:color w:val="0070C0"/>
+                <w:color w:val="000000"/>
                 <w:sz w:val="20"/>
                 <w:lang w:val="es-ES"/>
               </w:rPr>
@@ -12924,7 +12924,7 @@
               <w:jc w:val="both"/>
               <w:rPr>
                 <w:rFonts w:asciiTheme="minorHAnsi" w:hAnsiTheme="minorHAnsi" w:cstheme="minorHAnsi"/>
-                <w:color w:val="0070C0"/>
+                <w:color w:val="000000"/>
                 <w:sz w:val="20"/>
                 <w:lang w:val="es-ES"/>
               </w:rPr>
@@ -12951,7 +12951,7 @@
               <w:jc w:val="both"/>
               <w:rPr>
                 <w:rFonts w:asciiTheme="minorHAnsi" w:hAnsiTheme="minorHAnsi" w:cstheme="minorHAnsi"/>
-                <w:color w:val="0070C0"/>
+                <w:color w:val="000000"/>
                 <w:sz w:val="20"/>
                 <w:lang w:val="es-ES"/>
               </w:rPr>
@@ -12976,7 +12976,7 @@
               <w:jc w:val="both"/>
               <w:rPr>
                 <w:rFonts w:asciiTheme="minorHAnsi" w:hAnsiTheme="minorHAnsi" w:cstheme="minorHAnsi"/>
-                <w:color w:val="0070C0"/>
+                <w:color w:val="000000"/>
                 <w:sz w:val="20"/>
                 <w:lang w:val="es-ES"/>
               </w:rPr>
@@ -13001,7 +13001,7 @@
               <w:jc w:val="both"/>
               <w:rPr>
                 <w:rFonts w:asciiTheme="minorHAnsi" w:hAnsiTheme="minorHAnsi" w:cstheme="minorHAnsi"/>
-                <w:color w:val="0070C0"/>
+                <w:color w:val="000000"/>
                 <w:sz w:val="20"/>
                 <w:lang w:val="es-ES"/>
               </w:rPr>
@@ -13028,7 +13028,7 @@
               <w:jc w:val="both"/>
               <w:rPr>
                 <w:rFonts w:asciiTheme="minorHAnsi" w:hAnsiTheme="minorHAnsi" w:cstheme="minorHAnsi"/>
-                <w:color w:val="0070C0"/>
+                <w:color w:val="000000"/>
                 <w:sz w:val="20"/>
                 <w:lang w:val="es-ES"/>
               </w:rPr>
@@ -13053,7 +13053,7 @@
               <w:jc w:val="both"/>
               <w:rPr>
                 <w:rFonts w:asciiTheme="minorHAnsi" w:hAnsiTheme="minorHAnsi" w:cstheme="minorHAnsi"/>
-                <w:color w:val="0070C0"/>
+                <w:color w:val="000000"/>
                 <w:sz w:val="20"/>
                 <w:lang w:val="es-ES"/>
               </w:rPr>
@@ -13206,7 +13206,7 @@
               <w:jc w:val="both"/>
               <w:rPr>
                 <w:rFonts w:asciiTheme="minorHAnsi" w:hAnsiTheme="minorHAnsi" w:cstheme="minorHAnsi"/>
-                <w:color w:val="0070C0"/>
+                <w:color w:val="000000"/>
                 <w:sz w:val="20"/>
                 <w:lang w:val="es-ES"/>
               </w:rPr>
@@ -13233,7 +13233,7 @@
               <w:jc w:val="both"/>
               <w:rPr>
                 <w:rFonts w:asciiTheme="minorHAnsi" w:hAnsiTheme="minorHAnsi" w:cstheme="minorHAnsi"/>
-                <w:color w:val="0070C0"/>
+                <w:color w:val="000000"/>
                 <w:sz w:val="20"/>
                 <w:lang w:val="es-ES"/>
               </w:rPr>
@@ -13258,7 +13258,7 @@
               <w:jc w:val="both"/>
               <w:rPr>
                 <w:rFonts w:asciiTheme="minorHAnsi" w:hAnsiTheme="minorHAnsi" w:cstheme="minorHAnsi"/>
-                <w:color w:val="0070C0"/>
+                <w:color w:val="000000"/>
                 <w:sz w:val="20"/>
                 <w:lang w:val="es-ES"/>
               </w:rPr>
@@ -13340,7 +13340,7 @@
               <w:jc w:val="both"/>
               <w:rPr>
                 <w:rFonts w:asciiTheme="minorHAnsi" w:hAnsiTheme="minorHAnsi" w:cstheme="minorHAnsi"/>
-                <w:color w:val="0070C0"/>
+                <w:color w:val="000000"/>
                 <w:sz w:val="20"/>
                 <w:lang w:val="es-ES"/>
               </w:rPr>
@@ -22226,7 +22226,7 @@
                 <w:rFonts w:ascii="Calibri" w:eastAsia="SimSun" w:hAnsi="Calibri"/>
                 <w:i/>
                 <w:iCs/>
-                <w:color w:val="1B6FB5"/>
+                <w:color w:val="000000"/>
                 <w:sz w:val="20"/>
                 <w:lang w:val="es-ES" w:eastAsia="zh-CN"/>
               </w:rPr>
@@ -22259,7 +22259,7 @@
                 <w:rFonts w:ascii="Calibri" w:eastAsia="SimSun" w:hAnsi="Calibri"/>
                 <w:i/>
                 <w:iCs/>
-                <w:color w:val="1B6FB5"/>
+                <w:color w:val="000000"/>
                 <w:sz w:val="20"/>
                 <w:lang w:val="es-ES" w:eastAsia="zh-CN"/>
               </w:rPr>
@@ -22322,7 +22322,7 @@
                 <w:rFonts w:ascii="Calibri" w:eastAsia="SimSun" w:hAnsi="Calibri"/>
                 <w:i/>
                 <w:iCs/>
-                <w:color w:val="1B6FB5"/>
+                <w:color w:val="000000"/>
                 <w:sz w:val="20"/>
                 <w:lang w:val="es-ES" w:eastAsia="zh-CN"/>
               </w:rPr>
@@ -22362,7 +22362,7 @@
             </w:r>
             <w:r>
               <w:rPr>
-                <w:color w:val="0563C1"/>
+                <w:color w:val="000000"/>
                 <w:u w:val="single"/>
                 <w:lang w:val="es-ES"/>
               </w:rPr>
@@ -22370,7 +22370,7 @@
             </w:r>
             <w:r>
               <w:rPr>
-                <w:color w:val="0563C1"/>
+                <w:color w:val="000000"/>
                 <w:u w:val="single"/>
                 <w:lang w:val="es-ES"/>
               </w:rPr>
@@ -22378,7 +22378,7 @@
             </w:r>
             <w:r>
               <w:rPr>
-                <w:color w:val="0563C1"/>
+                <w:color w:val="000000"/>
                 <w:u w:val="single"/>
                 <w:lang w:val="es-ES"/>
               </w:rPr>
@@ -22401,7 +22401,7 @@
             <w:hyperlink r:id="rId19">
               <w:r>
                 <w:rPr>
-                  <w:color w:val="0563C1"/>
+                  <w:color w:val="000000"/>
                   <w:u w:val="single"/>
                   <w:lang w:val="es-ES"/>
                 </w:rPr>
@@ -22460,7 +22460,7 @@
                 <w:rFonts w:ascii="Calibri" w:eastAsia="SimSun" w:hAnsi="Calibri"/>
                 <w:i/>
                 <w:iCs/>
-                <w:color w:val="1B6FB5"/>
+                <w:color w:val="000000"/>
                 <w:sz w:val="20"/>
                 <w:lang w:val="es-ES" w:eastAsia="zh-CN"/>
               </w:rPr>
@@ -22492,7 +22492,7 @@
                 <w:rFonts w:ascii="Calibri" w:eastAsia="SimSun" w:hAnsi="Calibri"/>
                 <w:i/>
                 <w:iCs/>
-                <w:color w:val="1B6FB5"/>
+                <w:color w:val="000000"/>
                 <w:sz w:val="20"/>
                 <w:lang w:val="es-ES" w:eastAsia="zh-CN"/>
               </w:rPr>
@@ -22620,7 +22620,7 @@
                 <w:rFonts w:ascii="Calibri" w:eastAsia="SimSun" w:hAnsi="Calibri"/>
                 <w:i/>
                 <w:iCs/>
-                <w:color w:val="1B6FB5"/>
+                <w:color w:val="000000"/>
                 <w:sz w:val="20"/>
                 <w:lang w:val="es-ES" w:eastAsia="zh-CN"/>
               </w:rPr>
@@ -22652,7 +22652,7 @@
                 <w:rFonts w:ascii="Calibri" w:eastAsia="SimSun" w:hAnsi="Calibri"/>
                 <w:i/>
                 <w:iCs/>
-                <w:color w:val="1B6FB5"/>
+                <w:color w:val="000000"/>
                 <w:sz w:val="20"/>
                 <w:lang w:val="es-ES" w:eastAsia="zh-CN"/>
               </w:rPr>
@@ -22716,7 +22716,7 @@
                 <w:rFonts w:ascii="Calibri" w:eastAsia="SimSun" w:hAnsi="Calibri"/>
                 <w:i/>
                 <w:iCs/>
-                <w:color w:val="1B6FB5"/>
+                <w:color w:val="000000"/>
                 <w:sz w:val="20"/>
                 <w:lang w:val="es-ES" w:eastAsia="zh-CN"/>
               </w:rPr>
@@ -22764,7 +22764,7 @@
                 <w:rFonts w:ascii="Calibri" w:eastAsia="SimSun" w:hAnsi="Calibri"/>
                 <w:i/>
                 <w:iCs/>
-                <w:color w:val="1B6FB5"/>
+                <w:color w:val="000000"/>
                 <w:sz w:val="20"/>
                 <w:lang w:val="es-ES" w:eastAsia="zh-CN"/>
               </w:rPr>
@@ -22827,7 +22827,7 @@
                 <w:rFonts w:ascii="Calibri" w:eastAsia="SimSun" w:hAnsi="Calibri"/>
                 <w:i/>
                 <w:iCs/>
-                <w:color w:val="1B6FB5"/>
+                <w:color w:val="000000"/>
                 <w:sz w:val="20"/>
                 <w:lang w:eastAsia="zh-CN"/>
               </w:rPr>
@@ -22858,7 +22858,7 @@
                 <w:rFonts w:ascii="Calibri" w:eastAsia="SimSun" w:hAnsi="Calibri"/>
                 <w:i/>
                 <w:iCs/>
-                <w:color w:val="1B6FB5"/>
+                <w:color w:val="000000"/>
                 <w:sz w:val="20"/>
                 <w:lang w:val="en-US" w:eastAsia="zh-CN"/>
               </w:rPr>
@@ -22921,7 +22921,7 @@
                 <w:rFonts w:ascii="Calibri" w:eastAsia="SimSun" w:hAnsi="Calibri"/>
                 <w:i/>
                 <w:iCs/>
-                <w:color w:val="1B6FB5"/>
+                <w:color w:val="000000"/>
                 <w:sz w:val="20"/>
                 <w:lang w:eastAsia="zh-CN"/>
               </w:rPr>
@@ -22952,7 +22952,7 @@
                 <w:rFonts w:ascii="Calibri" w:eastAsia="SimSun" w:hAnsi="Calibri"/>
                 <w:i/>
                 <w:iCs/>
-                <w:color w:val="1B6FB5"/>
+                <w:color w:val="000000"/>
                 <w:sz w:val="20"/>
                 <w:lang w:val="es-ES" w:eastAsia="zh-CN"/>
               </w:rPr>
@@ -23015,14 +23015,14 @@
                 <w:rFonts w:eastAsia="SimSun"/>
                 <w:i/>
                 <w:iCs/>
-                <w:color w:val="1B6FB5"/>
+                <w:color w:val="000000"/>
                 <w:sz w:val="20"/>
                 <w:lang w:eastAsia="zh-CN"/>
               </w:rPr>
             </w:pPr>
             <w:r>
               <w:rPr>
-                <w:color w:val="222222"/>
+                <w:color w:val="000000"/>
                 <w:shd w:val="clear" w:color="auto" w:fill="FFFFFF"/>
               </w:rPr>
               <w:t>Vasey, B., Nagendran, M., Campbell, B.</w:t>
@@ -23030,7 +23030,7 @@
             <w:r>
               <w:rPr>
                 <w:rStyle w:val="apple-converted-space"/>
-                <w:color w:val="222222"/>
+                <w:color w:val="000000"/>
                 <w:shd w:val="clear" w:color="auto" w:fill="FFFFFF"/>
               </w:rPr>
               <w:t> </w:t>
@@ -23039,21 +23039,21 @@
               <w:rPr>
                 <w:i/>
                 <w:iCs/>
-                <w:color w:val="222222"/>
+                <w:color w:val="000000"/>
               </w:rPr>
               <w:t>et al.</w:t>
             </w:r>
             <w:r>
               <w:rPr>
                 <w:rStyle w:val="apple-converted-space"/>
-                <w:color w:val="222222"/>
+                <w:color w:val="000000"/>
                 <w:shd w:val="clear" w:color="auto" w:fill="FFFFFF"/>
               </w:rPr>
               <w:t> </w:t>
             </w:r>
             <w:r>
               <w:rPr>
-                <w:color w:val="222222"/>
+                <w:color w:val="000000"/>
                 <w:shd w:val="clear" w:color="auto" w:fill="FFFFFF"/>
               </w:rPr>
               <w:t>Reporting guideline for the early-stage clinical evaluation of decision support systems driven by artificial intelligence: DECIDE-AI.</w:t>
@@ -23061,7 +23061,7 @@
             <w:r>
               <w:rPr>
                 <w:rStyle w:val="apple-converted-space"/>
-                <w:color w:val="222222"/>
+                <w:color w:val="000000"/>
                 <w:shd w:val="clear" w:color="auto" w:fill="FFFFFF"/>
               </w:rPr>
               <w:t> </w:t>
@@ -23070,7 +23070,7 @@
               <w:rPr>
                 <w:i/>
                 <w:iCs/>
-                <w:color w:val="222222"/>
+                <w:color w:val="000000"/>
               </w:rPr>
               <w:t>Nat Med</w:t>
             </w:r>
@@ -23078,13 +23078,13 @@
               <w:rPr>
                 <w:b/>
                 <w:bCs/>
-                <w:color w:val="222222"/>
+                <w:color w:val="000000"/>
               </w:rPr>
               <w:t>28</w:t>
             </w:r>
             <w:r>
               <w:rPr>
-                <w:color w:val="222222"/>
+                <w:color w:val="000000"/>
                 <w:shd w:val="clear" w:color="auto" w:fill="FFFFFF"/>
               </w:rPr>
               <w:t>, 924–933 (2022).</w:t>
@@ -23109,7 +23109,7 @@
                 <w:rFonts w:ascii="Calibri" w:eastAsia="SimSun" w:hAnsi="Calibri"/>
                 <w:i/>
                 <w:iCs/>
-                <w:color w:val="1B6FB5"/>
+                <w:color w:val="000000"/>
                 <w:sz w:val="20"/>
                 <w:lang w:val="es-ES" w:eastAsia="zh-CN"/>
               </w:rPr>
@@ -23174,7 +23174,7 @@
                 <w:rFonts w:ascii="Calibri" w:eastAsia="SimSun" w:hAnsi="Calibri"/>
                 <w:i/>
                 <w:iCs/>
-                <w:color w:val="1B6FB5"/>
+                <w:color w:val="000000"/>
                 <w:sz w:val="20"/>
                 <w:lang w:eastAsia="zh-CN"/>
               </w:rPr>
@@ -23205,7 +23205,7 @@
                 <w:rFonts w:ascii="Calibri" w:eastAsia="SimSun" w:hAnsi="Calibri"/>
                 <w:i/>
                 <w:iCs/>
-                <w:color w:val="1B6FB5"/>
+                <w:color w:val="000000"/>
                 <w:sz w:val="20"/>
                 <w:lang w:val="en-US" w:eastAsia="zh-CN"/>
               </w:rPr>
@@ -23282,7 +23282,7 @@
                 <w:rFonts w:ascii="Calibri" w:eastAsia="SimSun" w:hAnsi="Calibri"/>
                 <w:i/>
                 <w:iCs/>
-                <w:color w:val="1B6FB5"/>
+                <w:color w:val="000000"/>
                 <w:sz w:val="20"/>
                 <w:lang w:eastAsia="zh-CN"/>
               </w:rPr>
@@ -23335,7 +23335,7 @@
                 <w:rFonts w:ascii="Calibri" w:eastAsia="SimSun" w:hAnsi="Calibri"/>
                 <w:i/>
                 <w:iCs/>
-                <w:color w:val="1B6FB5"/>
+                <w:color w:val="000000"/>
                 <w:sz w:val="20"/>
                 <w:lang w:val="es-ES" w:eastAsia="zh-CN"/>
               </w:rPr>
@@ -23357,7 +23357,7 @@
           <w:rFonts w:ascii="Calibri" w:eastAsia="SimSun" w:hAnsi="Calibri"/>
           <w:i/>
           <w:iCs/>
-          <w:color w:val="0070C0"/>
+          <w:color w:val="000000"/>
           <w:sz w:val="20"/>
           <w:lang w:val="es-ES" w:eastAsia="zh-CN"/>
         </w:rPr>
@@ -23371,7 +23371,7 @@
         <w:rPr>
           <w:rFonts w:ascii="Calibri" w:hAnsi="Calibri"/>
           <w:i w:val="0"/>
-          <w:color w:val="0070C0"/>
+          <w:color w:val="000000"/>
           <w:sz w:val="20"/>
           <w:szCs w:val="22"/>
           <w:lang w:val="es-ES"/>
@@ -23386,7 +23386,7 @@
         <w:rPr>
           <w:rFonts w:ascii="Calibri" w:hAnsi="Calibri"/>
           <w:i w:val="0"/>
-          <w:color w:val="0070C0"/>
+          <w:color w:val="000000"/>
           <w:sz w:val="20"/>
           <w:szCs w:val="22"/>
           <w:lang w:val="es-ES"/>
@@ -23477,7 +23477,7 @@
     <w:r>
       <w:rPr>
         <w:rFonts w:asciiTheme="minorHAnsi" w:hAnsiTheme="minorHAnsi" w:cstheme="minorHAnsi"/>
-        <w:color w:val="000000" w:themeColor="text1"/>
+        <w:color w:val="000000"/>
         <w:szCs w:val="16"/>
         <w:lang w:val="fr-BE"/>
       </w:rPr>
@@ -23487,7 +23487,7 @@
     <w:r>
       <w:rPr>
         <w:rFonts w:asciiTheme="minorHAnsi" w:hAnsiTheme="minorHAnsi" w:cstheme="minorHAnsi"/>
-        <w:color w:val="000000" w:themeColor="text1"/>
+        <w:color w:val="000000"/>
         <w:szCs w:val="16"/>
         <w:lang w:val="fr-BE"/>
       </w:rPr>
@@ -23498,7 +23498,7 @@
         <w:rPr>
           <w:rFonts w:asciiTheme="minorHAnsi" w:hAnsiTheme="minorHAnsi" w:cstheme="minorHAnsi"/>
           <w:bCs/>
-          <w:color w:val="984806"/>
+          <w:color w:val="000000"/>
           <w:szCs w:val="16"/>
           <w:lang w:val="es-ES"/>
         </w:rPr>
@@ -23529,7 +23529,7 @@
       <w:rPr>
         <w:rFonts w:asciiTheme="minorHAnsi" w:hAnsiTheme="minorHAnsi" w:cstheme="minorHAnsi"/>
         <w:bCs/>
-        <w:color w:val="1B6FB5"/>
+        <w:color w:val="000000"/>
         <w:lang w:val="fr-BE"/>
       </w:rPr>
       <w:t xml:space="preserve">                                                     </w:t>
@@ -23641,7 +23641,7 @@
       <w:rPr>
         <w:rFonts w:asciiTheme="minorHAnsi" w:hAnsiTheme="minorHAnsi" w:cstheme="minorHAnsi"/>
         <w:bCs/>
-        <w:color w:val="1B6FB5"/>
+        <w:color w:val="000000"/>
         <w:lang w:val="fr-BE"/>
       </w:rPr>
       <w:t xml:space="preserve">                                                                         </w:t>
@@ -23650,7 +23650,7 @@
     <w:r>
       <w:rPr>
         <w:rFonts w:asciiTheme="minorHAnsi" w:hAnsiTheme="minorHAnsi" w:cstheme="minorHAnsi"/>
-        <w:color w:val="000000" w:themeColor="text1"/>
+        <w:color w:val="000000"/>
         <w:szCs w:val="16"/>
         <w:lang w:val="fr-BE"/>
       </w:rPr>
@@ -23659,7 +23659,7 @@
     <w:r>
       <w:rPr>
         <w:rFonts w:asciiTheme="minorHAnsi" w:hAnsiTheme="minorHAnsi" w:cstheme="minorHAnsi"/>
-        <w:color w:val="000000" w:themeColor="text1"/>
+        <w:color w:val="000000"/>
         <w:szCs w:val="16"/>
         <w:lang w:val="fr-BE"/>
       </w:rPr>
@@ -23669,7 +23669,7 @@
     <w:r>
       <w:rPr>
         <w:rFonts w:asciiTheme="minorHAnsi" w:hAnsiTheme="minorHAnsi" w:cstheme="minorHAnsi"/>
-        <w:color w:val="000000" w:themeColor="text1"/>
+        <w:color w:val="000000"/>
         <w:szCs w:val="16"/>
         <w:lang w:val="fr-BE"/>
       </w:rPr>
@@ -23678,7 +23678,7 @@
     <w:r>
       <w:rPr>
         <w:rFonts w:asciiTheme="minorHAnsi" w:eastAsia="PMingLiU" w:hAnsiTheme="minorHAnsi" w:cstheme="minorHAnsi"/>
-        <w:color w:val="1B6FB5"/>
+        <w:color w:val="000000"/>
         <w:szCs w:val="16"/>
         <w:lang w:val="fr-BE"/>
       </w:rPr>
@@ -23688,7 +23688,7 @@
       <w:sdtPr>
         <w:rPr>
           <w:rFonts w:asciiTheme="minorHAnsi" w:eastAsia="PMingLiU" w:hAnsiTheme="minorHAnsi" w:cstheme="minorHAnsi"/>
-          <w:color w:val="984806"/>
+          <w:color w:val="000000"/>
           <w:szCs w:val="16"/>
           <w:lang w:val="fr-BE"/>
         </w:rPr>
@@ -23713,7 +23713,7 @@
     <w:r>
       <w:rPr>
         <w:rFonts w:asciiTheme="minorHAnsi" w:eastAsia="PMingLiU" w:hAnsiTheme="minorHAnsi" w:cstheme="minorHAnsi"/>
-        <w:color w:val="1B6FB5"/>
+        <w:color w:val="000000"/>
         <w:szCs w:val="16"/>
         <w:lang w:val="fr-BE"/>
       </w:rPr>
@@ -23767,7 +23767,7 @@
     <w:r>
       <w:rPr>
         <w:rFonts w:asciiTheme="minorHAnsi" w:hAnsiTheme="minorHAnsi" w:cstheme="minorHAnsi"/>
-        <w:color w:val="000000" w:themeColor="text1"/>
+        <w:color w:val="000000"/>
         <w:szCs w:val="16"/>
         <w:lang w:val="fr-BE"/>
       </w:rPr>
@@ -23778,7 +23778,7 @@
         <w:rPr>
           <w:rFonts w:asciiTheme="minorHAnsi" w:hAnsiTheme="minorHAnsi" w:cstheme="minorHAnsi"/>
           <w:bCs/>
-          <w:color w:val="984806"/>
+          <w:color w:val="000000"/>
           <w:szCs w:val="16"/>
           <w:lang w:val="es-ES"/>
         </w:rPr>
@@ -23809,7 +23809,7 @@
       <w:rPr>
         <w:rFonts w:asciiTheme="minorHAnsi" w:hAnsiTheme="minorHAnsi" w:cstheme="minorHAnsi"/>
         <w:bCs/>
-        <w:color w:val="1B6FB5"/>
+        <w:color w:val="000000"/>
         <w:lang w:val="fr-BE"/>
       </w:rPr>
       <w:t xml:space="preserve">                                                                                          </w:t>
@@ -23913,7 +23913,7 @@
       <w:rPr>
         <w:rFonts w:asciiTheme="minorHAnsi" w:hAnsiTheme="minorHAnsi" w:cstheme="minorHAnsi"/>
         <w:bCs/>
-        <w:color w:val="1B6FB5"/>
+        <w:color w:val="000000"/>
         <w:lang w:val="fr-BE"/>
       </w:rPr>
       <w:t xml:space="preserve">                                                                      </w:t>
@@ -23921,7 +23921,7 @@
     <w:r>
       <w:rPr>
         <w:rFonts w:asciiTheme="minorHAnsi" w:hAnsiTheme="minorHAnsi" w:cstheme="minorHAnsi"/>
-        <w:color w:val="000000" w:themeColor="text1"/>
+        <w:color w:val="000000"/>
         <w:szCs w:val="16"/>
         <w:lang w:val="fr-BE"/>
       </w:rPr>
@@ -23930,7 +23930,7 @@
     <w:r>
       <w:rPr>
         <w:rFonts w:asciiTheme="minorHAnsi" w:eastAsia="PMingLiU" w:hAnsiTheme="minorHAnsi" w:cstheme="minorHAnsi"/>
-        <w:color w:val="1B6FB5"/>
+        <w:color w:val="000000"/>
         <w:szCs w:val="16"/>
         <w:lang w:val="fr-BE"/>
       </w:rPr>
@@ -23940,7 +23940,7 @@
       <w:sdtPr>
         <w:rPr>
           <w:rFonts w:asciiTheme="minorHAnsi" w:eastAsia="PMingLiU" w:hAnsiTheme="minorHAnsi" w:cstheme="minorHAnsi"/>
-          <w:color w:val="984806"/>
+          <w:color w:val="000000"/>
           <w:szCs w:val="16"/>
           <w:lang w:val="fr-BE"/>
         </w:rPr>
@@ -23965,7 +23965,7 @@
     <w:r>
       <w:rPr>
         <w:rFonts w:asciiTheme="minorHAnsi" w:eastAsia="PMingLiU" w:hAnsiTheme="minorHAnsi" w:cstheme="minorHAnsi"/>
-        <w:color w:val="1B6FB5"/>
+        <w:color w:val="000000"/>
         <w:szCs w:val="16"/>
         <w:lang w:val="fr-BE"/>
       </w:rPr>
@@ -24272,7 +24272,7 @@
     <w:r>
       <w:rPr>
         <w:rFonts w:asciiTheme="minorHAnsi" w:eastAsia="PMingLiU" w:hAnsiTheme="minorHAnsi" w:cstheme="minorHAnsi"/>
-        <w:color w:val="1B6FB5"/>
+        <w:color w:val="000000"/>
         <w:sz w:val="20"/>
         <w:lang w:val="es-ES"/>
       </w:rPr>
@@ -24282,7 +24282,7 @@
       <w:sdtPr>
         <w:rPr>
           <w:rFonts w:asciiTheme="minorHAnsi" w:eastAsia="PMingLiU" w:hAnsiTheme="minorHAnsi" w:cstheme="minorHAnsi"/>
-          <w:color w:val="984806"/>
+          <w:color w:val="000000"/>
           <w:sz w:val="18"/>
           <w:szCs w:val="18"/>
           <w:lang w:val="es-ES"/>
@@ -30103,7 +30103,7 @@
   <w:style w:type="character" w:styleId="Hipervnculovisitado">
     <w:name w:val="FollowedHyperlink"/>
     <w:rPr>
-      <w:color w:val="800080"/>
+      <w:color w:val="000000"/>
       <w:u w:val="single"/>
     </w:rPr>
   </w:style>
@@ -30133,7 +30133,7 @@
     <w:name w:val="Hyperlink"/>
     <w:aliases w:val="Hyperlink - Header"/>
     <w:rPr>
-      <w:color w:val="0000FF"/>
+      <w:color w:val="000000"/>
       <w:u w:val="single"/>
     </w:rPr>
   </w:style>
@@ -30479,7 +30479,7 @@
       <w:i/>
       <w:iCs/>
       <w:vanish/>
-      <w:color w:val="0000FF"/>
+      <w:color w:val="000000"/>
       <w:lang w:val="en-GB" w:eastAsia="en-US" w:bidi="ar-SA"/>
     </w:rPr>
   </w:style>
@@ -30508,7 +30508,7 @@
       <w:i/>
       <w:iCs/>
       <w:vanish/>
-      <w:color w:val="0000FF"/>
+      <w:color w:val="000000"/>
       <w:sz w:val="20"/>
     </w:rPr>
   </w:style>
@@ -30652,7 +30652,7 @@
       <w:rFonts w:eastAsia="SimSun"/>
       <w:i/>
       <w:iCs/>
-      <w:color w:val="0000FF"/>
+      <w:color w:val="000000"/>
       <w:sz w:val="24"/>
       <w:lang w:val="fr-BE" w:eastAsia="zh-CN"/>
     </w:rPr>
@@ -30691,7 +30691,7 @@
       <w:rFonts w:eastAsia="SimSun"/>
       <w:i/>
       <w:iCs/>
-      <w:color w:val="0000FF"/>
+      <w:color w:val="000000"/>
       <w:sz w:val="24"/>
       <w:lang w:val="fr-BE" w:eastAsia="zh-CN" w:bidi="ar-SA"/>
     </w:rPr>
@@ -30707,7 +30707,7 @@
     <w:rPr>
       <w:i/>
       <w:iCs/>
-      <w:color w:val="0000FF"/>
+      <w:color w:val="000000"/>
       <w:sz w:val="24"/>
       <w:lang w:val="fr-BE" w:eastAsia="zh-CN"/>
     </w:rPr>
@@ -30719,7 +30719,7 @@
     <w:rPr>
       <w:i/>
       <w:iCs/>
-      <w:color w:val="0000FF"/>
+      <w:color w:val="000000"/>
       <w:sz w:val="24"/>
     </w:rPr>
   </w:style>
@@ -30874,7 +30874,7 @@
       <w:rFonts w:ascii="Arial" w:eastAsia="SimSun" w:hAnsi="Arial" w:cs="Arial"/>
       <w:i/>
       <w:iCs/>
-      <w:color w:val="7F7F7F"/>
+      <w:color w:val="000000"/>
       <w:sz w:val="24"/>
       <w:lang w:val="fr-BE" w:eastAsia="zh-CN"/>
     </w:rPr>
@@ -30887,7 +30887,7 @@
     <w:rsid w:val="009C32EE"/>
     <w:rPr>
       <w:rFonts w:ascii="Arial" w:hAnsi="Arial" w:cs="Arial"/>
-      <w:color w:val="7F7F7F"/>
+      <w:color w:val="000000"/>
     </w:rPr>
   </w:style>
   <w:style w:type="character" w:customStyle="1" w:styleId="TextonotapieCar">
@@ -30922,7 +30922,7 @@
     <w:rPr>
       <w:i/>
       <w:iCs/>
-      <w:color w:val="0000FF"/>
+      <w:color w:val="000000"/>
       <w:sz w:val="24"/>
     </w:rPr>
   </w:style>
@@ -31022,7 +31022,7 @@
     <w:unhideWhenUsed/>
     <w:rsid w:val="0080254D"/>
     <w:rPr>
-      <w:color w:val="605E5C"/>
+      <w:color w:val="000000"/>
       <w:shd w:val="clear" w:color="auto" w:fill="E1DFDD"/>
     </w:rPr>
   </w:style>

</xml_diff>